<commit_message>
Add violation_examples.csv to track multi-stage skip events in growth progression
</commit_message>
<xml_diff>
--- a/docs/Documents/AgriTwin-GH - First Review Report.docx
+++ b/docs/Documents/AgriTwin-GH - First Review Report.docx
@@ -1214,7 +1214,25 @@
                 <w:sz w:val="26"/>
                 <w:szCs w:val="26"/>
               </w:rPr>
-              <w:t>2.3 EfficientNet Architecture</w:t>
+              <w:t xml:space="preserve">2.3 </w:t>
+            </w:r>
+            <w:proofErr w:type="spellStart"/>
+            <w:r>
+              <w:rPr>
+                <w:color w:val="000000" w:themeColor="text1"/>
+                <w:sz w:val="26"/>
+                <w:szCs w:val="26"/>
+              </w:rPr>
+              <w:t>EfficientNet</w:t>
+            </w:r>
+            <w:proofErr w:type="spellEnd"/>
+            <w:r>
+              <w:rPr>
+                <w:color w:val="000000" w:themeColor="text1"/>
+                <w:sz w:val="26"/>
+                <w:szCs w:val="26"/>
+              </w:rPr>
+              <w:t xml:space="preserve"> Architecture</w:t>
             </w:r>
             <w:r>
               <w:rPr>
@@ -3434,7 +3452,21 @@
                     <w:rPr>
                       <w:color w:val="000000" w:themeColor="text1"/>
                     </w:rPr>
-                    <w:t>High-Level Architecture Diagram of AgriTwin-GH</w:t>
+                    <w:t xml:space="preserve">High-Level Architecture Diagram of </w:t>
+                  </w:r>
+                  <w:proofErr w:type="spellStart"/>
+                  <w:r>
+                    <w:rPr>
+                      <w:color w:val="000000" w:themeColor="text1"/>
+                    </w:rPr>
+                    <w:t>AgriTwin</w:t>
+                  </w:r>
+                  <w:proofErr w:type="spellEnd"/>
+                  <w:r>
+                    <w:rPr>
+                      <w:color w:val="000000" w:themeColor="text1"/>
+                    </w:rPr>
+                    <w:t>-GH</w:t>
                   </w:r>
                   <w:r>
                     <w:rPr>
@@ -4160,7 +4192,15 @@
               <w:jc w:val="both"/>
             </w:pPr>
             <w:r>
-              <w:t>Extract of the Dindigul Weather Dataset</w:t>
+              <w:t xml:space="preserve">Extract of the </w:t>
+            </w:r>
+            <w:proofErr w:type="spellStart"/>
+            <w:r>
+              <w:t>Dindigul</w:t>
+            </w:r>
+            <w:proofErr w:type="spellEnd"/>
+            <w:r>
+              <w:t xml:space="preserve"> Weather Dataset</w:t>
             </w:r>
             <w:r>
               <w:t xml:space="preserve"> ...</w:t>
@@ -5756,6 +5796,42 @@
       <w:pPr>
         <w:pStyle w:val="NormalWeb"/>
         <w:spacing w:before="0" w:beforeAutospacing="0" w:after="160" w:afterAutospacing="0"/>
+        <w:jc w:val="both"/>
+        <w:rPr>
+          <w:b/>
+          <w:bCs/>
+          <w:color w:val="000000" w:themeColor="text1"/>
+        </w:rPr>
+      </w:pPr>
+    </w:p>
+    <w:p>
+      <w:pPr>
+        <w:pStyle w:val="NormalWeb"/>
+        <w:spacing w:before="0" w:beforeAutospacing="0" w:after="160" w:afterAutospacing="0"/>
+        <w:jc w:val="both"/>
+        <w:rPr>
+          <w:b/>
+          <w:bCs/>
+          <w:color w:val="000000" w:themeColor="text1"/>
+        </w:rPr>
+      </w:pPr>
+    </w:p>
+    <w:p>
+      <w:pPr>
+        <w:pStyle w:val="NormalWeb"/>
+        <w:spacing w:before="0" w:beforeAutospacing="0" w:after="160" w:afterAutospacing="0"/>
+        <w:jc w:val="both"/>
+        <w:rPr>
+          <w:b/>
+          <w:bCs/>
+          <w:color w:val="000000" w:themeColor="text1"/>
+        </w:rPr>
+      </w:pPr>
+    </w:p>
+    <w:p>
+      <w:pPr>
+        <w:pStyle w:val="NormalWeb"/>
+        <w:spacing w:before="0" w:beforeAutospacing="0" w:after="160" w:afterAutospacing="0"/>
         <w:jc w:val="center"/>
         <w:rPr>
           <w:b/>
@@ -5773,6 +5849,7 @@
           <w:sz w:val="36"/>
           <w:szCs w:val="36"/>
         </w:rPr>
+        <w:lastRenderedPageBreak/>
         <w:t>ABBREVIATIONS</w:t>
       </w:r>
     </w:p>
@@ -5841,7 +5918,6 @@
                 <w:sz w:val="26"/>
                 <w:szCs w:val="26"/>
               </w:rPr>
-              <w:lastRenderedPageBreak/>
               <w:t>Abbreviation</w:t>
             </w:r>
           </w:p>
@@ -7077,7 +7153,27 @@
           <w:sz w:val="24"/>
           <w:szCs w:val="24"/>
         </w:rPr>
-        <w:t>To address these limitations, this project presents AgriTwin-GH, a software-based AI-powered digital twin framework for smart greenhouse management. The proposed framework leverages data-driven analysis of greenhouse environmental conditions and plant health information to enable early disease risk awareness, future condition assessment, and proactive decision support. Instead of relying on physical sensor infrastructure, the system operates using open-source greenhouse datasets and plant image data, allowing flexible experimentation and cost-effective deployment.</w:t>
+        <w:t xml:space="preserve">To address these limitations, this project presents </w:t>
+      </w:r>
+      <w:proofErr w:type="spellStart"/>
+      <w:r>
+        <w:rPr>
+          <w:rFonts w:ascii="Times New Roman" w:eastAsia="Times New Roman" w:hAnsi="Times New Roman" w:cs="Times New Roman"/>
+          <w:color w:val="000000" w:themeColor="text1"/>
+          <w:sz w:val="24"/>
+          <w:szCs w:val="24"/>
+        </w:rPr>
+        <w:t>AgriTwin</w:t>
+      </w:r>
+      <w:proofErr w:type="spellEnd"/>
+      <w:r>
+        <w:rPr>
+          <w:rFonts w:ascii="Times New Roman" w:eastAsia="Times New Roman" w:hAnsi="Times New Roman" w:cs="Times New Roman"/>
+          <w:color w:val="000000" w:themeColor="text1"/>
+          <w:sz w:val="24"/>
+          <w:szCs w:val="24"/>
+        </w:rPr>
+        <w:t>-GH, a software-based AI-powered digital twin framework for smart greenhouse management. The proposed framework leverages data-driven analysis of greenhouse environmental conditions and plant health information to enable early disease risk awareness, future condition assessment, and proactive decision support. Instead of relying on physical sensor infrastructure, the system operates using open-source greenhouse datasets and plant image data, allowing flexible experimentation and cost-effective deployment.</w:t>
       </w:r>
     </w:p>
     <w:p>
@@ -7091,6 +7187,7 @@
           <w:szCs w:val="24"/>
         </w:rPr>
       </w:pPr>
+      <w:proofErr w:type="spellStart"/>
       <w:r>
         <w:rPr>
           <w:rFonts w:ascii="Times New Roman" w:eastAsia="Times New Roman" w:hAnsi="Times New Roman" w:cs="Times New Roman"/>
@@ -7098,7 +7195,37 @@
           <w:sz w:val="24"/>
           <w:szCs w:val="24"/>
         </w:rPr>
-        <w:t>AgriTwin-GH provides disease-aware predictions, greenhouse condition forecasts, and safety-validated control recommendations, which are translated into simple non-verbal operational alerts for practical usability in labor-intensive greenhouse environments. By shifting greenhouse operations from reactive responses to predictive and preventive management, the framework improves crop productivity and quality while significantly reducing unnecessary water, energy, and fertilizer usage.</w:t>
+        <w:t>AgriTwin</w:t>
+      </w:r>
+      <w:proofErr w:type="spellEnd"/>
+      <w:r>
+        <w:rPr>
+          <w:rFonts w:ascii="Times New Roman" w:eastAsia="Times New Roman" w:hAnsi="Times New Roman" w:cs="Times New Roman"/>
+          <w:color w:val="000000" w:themeColor="text1"/>
+          <w:sz w:val="24"/>
+          <w:szCs w:val="24"/>
+        </w:rPr>
+        <w:t xml:space="preserve">-GH provides disease-aware predictions, greenhouse condition forecasts, and safety-validated control recommendations, which are translated into simple non-verbal operational alerts for practical usability in </w:t>
+      </w:r>
+      <w:proofErr w:type="spellStart"/>
+      <w:r>
+        <w:rPr>
+          <w:rFonts w:ascii="Times New Roman" w:eastAsia="Times New Roman" w:hAnsi="Times New Roman" w:cs="Times New Roman"/>
+          <w:color w:val="000000" w:themeColor="text1"/>
+          <w:sz w:val="24"/>
+          <w:szCs w:val="24"/>
+        </w:rPr>
+        <w:t>labor-intensive</w:t>
+      </w:r>
+      <w:proofErr w:type="spellEnd"/>
+      <w:r>
+        <w:rPr>
+          <w:rFonts w:ascii="Times New Roman" w:eastAsia="Times New Roman" w:hAnsi="Times New Roman" w:cs="Times New Roman"/>
+          <w:color w:val="000000" w:themeColor="text1"/>
+          <w:sz w:val="24"/>
+          <w:szCs w:val="24"/>
+        </w:rPr>
+        <w:t xml:space="preserve"> greenhouse environments. By shifting greenhouse operations from reactive responses to predictive and preventive management, the framework improves crop productivity and quality while significantly reducing unnecessary water, energy, and fertilizer usage.</w:t>
       </w:r>
     </w:p>
     <w:p>
@@ -7288,7 +7415,43 @@
           <w:sz w:val="24"/>
           <w:szCs w:val="24"/>
         </w:rPr>
-        <w:t>Modern smart agriculture systems increasingly rely on advanced computational techniques to analyze environmental conditions and plant health. The integration of artificial intelligence, machine learning, and computer vision technologies enables automated monitoring and decision-making in greenhouse environments. These techniques help identify plant diseases, track crop development, and analyze environmental parameters that influence plant growth.</w:t>
+        <w:t xml:space="preserve">Modern smart agriculture systems increasingly rely on advanced computational techniques to </w:t>
+      </w:r>
+      <w:proofErr w:type="spellStart"/>
+      <w:r>
+        <w:rPr>
+          <w:rFonts w:ascii="Times New Roman" w:eastAsia="Times New Roman" w:hAnsi="Times New Roman" w:cs="Times New Roman"/>
+          <w:sz w:val="24"/>
+          <w:szCs w:val="24"/>
+        </w:rPr>
+        <w:t>analyze</w:t>
+      </w:r>
+      <w:proofErr w:type="spellEnd"/>
+      <w:r>
+        <w:rPr>
+          <w:rFonts w:ascii="Times New Roman" w:eastAsia="Times New Roman" w:hAnsi="Times New Roman" w:cs="Times New Roman"/>
+          <w:sz w:val="24"/>
+          <w:szCs w:val="24"/>
+        </w:rPr>
+        <w:t xml:space="preserve"> environmental conditions and plant health. The integration of artificial intelligence, machine learning, and computer vision technologies enables automated monitoring and decision-making in greenhouse environments. These techniques help identify plant diseases, track crop development, and </w:t>
+      </w:r>
+      <w:proofErr w:type="spellStart"/>
+      <w:r>
+        <w:rPr>
+          <w:rFonts w:ascii="Times New Roman" w:eastAsia="Times New Roman" w:hAnsi="Times New Roman" w:cs="Times New Roman"/>
+          <w:sz w:val="24"/>
+          <w:szCs w:val="24"/>
+        </w:rPr>
+        <w:t>analyze</w:t>
+      </w:r>
+      <w:proofErr w:type="spellEnd"/>
+      <w:r>
+        <w:rPr>
+          <w:rFonts w:ascii="Times New Roman" w:eastAsia="Times New Roman" w:hAnsi="Times New Roman" w:cs="Times New Roman"/>
+          <w:sz w:val="24"/>
+          <w:szCs w:val="24"/>
+        </w:rPr>
+        <w:t xml:space="preserve"> environmental parameters that influence plant growth.</w:t>
       </w:r>
     </w:p>
     <w:p>
@@ -7382,7 +7545,25 @@
           <w:sz w:val="24"/>
           <w:szCs w:val="24"/>
         </w:rPr>
-        <w:t>Convolutional Neural Networks (CNNs) are a type of deep learning architecture specifically designed for image processing and computer vision tasks. CNNs are capable of automatically learning spatial features from images, making them highly suitable for analyzing visual data such as plant leaves, fruits, and crop images.</w:t>
+        <w:t xml:space="preserve">Convolutional Neural Networks (CNNs) are a type of deep learning architecture specifically designed for image processing and computer vision tasks. CNNs are capable of automatically learning spatial features from images, making them highly suitable for </w:t>
+      </w:r>
+      <w:proofErr w:type="spellStart"/>
+      <w:r>
+        <w:rPr>
+          <w:rFonts w:ascii="Times New Roman" w:eastAsia="Times New Roman" w:hAnsi="Times New Roman" w:cs="Times New Roman"/>
+          <w:sz w:val="24"/>
+          <w:szCs w:val="24"/>
+        </w:rPr>
+        <w:t>analyzing</w:t>
+      </w:r>
+      <w:proofErr w:type="spellEnd"/>
+      <w:r>
+        <w:rPr>
+          <w:rFonts w:ascii="Times New Roman" w:eastAsia="Times New Roman" w:hAnsi="Times New Roman" w:cs="Times New Roman"/>
+          <w:sz w:val="24"/>
+          <w:szCs w:val="24"/>
+        </w:rPr>
+        <w:t xml:space="preserve"> visual data such as plant leaves, fruits, and crop images.</w:t>
       </w:r>
     </w:p>
     <w:p>
@@ -7500,7 +7681,25 @@
           <w:sz w:val="24"/>
           <w:szCs w:val="24"/>
         </w:rPr>
-        <w:t>Transfer learning has become widely used in computer vision applications because it enables high model performance even when limited labeled data is available.</w:t>
+        <w:t xml:space="preserve">Transfer learning has become widely used in computer vision applications because it enables high model performance even when limited </w:t>
+      </w:r>
+      <w:proofErr w:type="spellStart"/>
+      <w:r>
+        <w:rPr>
+          <w:rFonts w:ascii="Times New Roman" w:eastAsia="Times New Roman" w:hAnsi="Times New Roman" w:cs="Times New Roman"/>
+          <w:sz w:val="24"/>
+          <w:szCs w:val="24"/>
+        </w:rPr>
+        <w:t>labeled</w:t>
+      </w:r>
+      <w:proofErr w:type="spellEnd"/>
+      <w:r>
+        <w:rPr>
+          <w:rFonts w:ascii="Times New Roman" w:eastAsia="Times New Roman" w:hAnsi="Times New Roman" w:cs="Times New Roman"/>
+          <w:sz w:val="24"/>
+          <w:szCs w:val="24"/>
+        </w:rPr>
+        <w:t xml:space="preserve"> data is available.</w:t>
       </w:r>
     </w:p>
     <w:p>
@@ -7536,51 +7735,125 @@
           <w:szCs w:val="24"/>
         </w:rPr>
       </w:pPr>
-      <w:r>
-        <w:rPr>
-          <w:rFonts w:ascii="Times New Roman" w:eastAsia="Times New Roman" w:hAnsi="Times New Roman" w:cs="Times New Roman"/>
-          <w:sz w:val="24"/>
-          <w:szCs w:val="24"/>
-        </w:rPr>
-        <w:t>EfficientNet is a modern deep learning architecture designed to improve the performance and efficiency of convolutional neural networks. Traditional CNN architectures often increase network depth or width to improve accuracy. EfficientNet introduces a compound scaling method that balances network depth, width, and input resolution to achieve better performance with fewer parameters.</w:t>
-      </w:r>
-    </w:p>
-    <w:p>
-      <w:pPr>
-        <w:spacing w:beforeAutospacing="1" w:afterAutospacing="1" w:line="240" w:lineRule="auto"/>
-        <w:jc w:val="both"/>
-        <w:rPr>
-          <w:rFonts w:ascii="Times New Roman" w:eastAsia="Times New Roman" w:hAnsi="Times New Roman" w:cs="Times New Roman"/>
-          <w:sz w:val="24"/>
-          <w:szCs w:val="24"/>
-        </w:rPr>
-      </w:pPr>
-      <w:r>
-        <w:rPr>
-          <w:rFonts w:ascii="Times New Roman" w:eastAsia="Times New Roman" w:hAnsi="Times New Roman" w:cs="Times New Roman"/>
-          <w:sz w:val="24"/>
-          <w:szCs w:val="24"/>
-        </w:rPr>
-        <w:t>This balanced scaling approach allows EfficientNet models to achieve high accuracy while maintaining computational efficiency. As a result, EfficientNet architectures are widely used in image classification tasks where both performance and computational efficiency are important.</w:t>
-      </w:r>
-    </w:p>
-    <w:p>
-      <w:pPr>
-        <w:spacing w:beforeAutospacing="1" w:afterAutospacing="1" w:line="240" w:lineRule="auto"/>
-        <w:jc w:val="both"/>
-        <w:rPr>
-          <w:rFonts w:ascii="Times New Roman" w:eastAsia="Times New Roman" w:hAnsi="Times New Roman" w:cs="Times New Roman"/>
-          <w:sz w:val="24"/>
-          <w:szCs w:val="24"/>
-        </w:rPr>
-      </w:pPr>
-      <w:r>
-        <w:rPr>
-          <w:rFonts w:ascii="Times New Roman" w:eastAsia="Times New Roman" w:hAnsi="Times New Roman" w:cs="Times New Roman"/>
-          <w:sz w:val="24"/>
-          <w:szCs w:val="24"/>
-        </w:rPr>
-        <w:t>EfficientNet models have demonstrated strong performance in various computer vision applications, including plant disease detection, object recognition, and medical image analysis.</w:t>
+      <w:proofErr w:type="spellStart"/>
+      <w:r>
+        <w:rPr>
+          <w:rFonts w:ascii="Times New Roman" w:eastAsia="Times New Roman" w:hAnsi="Times New Roman" w:cs="Times New Roman"/>
+          <w:sz w:val="24"/>
+          <w:szCs w:val="24"/>
+        </w:rPr>
+        <w:t>EfficientNet</w:t>
+      </w:r>
+      <w:proofErr w:type="spellEnd"/>
+      <w:r>
+        <w:rPr>
+          <w:rFonts w:ascii="Times New Roman" w:eastAsia="Times New Roman" w:hAnsi="Times New Roman" w:cs="Times New Roman"/>
+          <w:sz w:val="24"/>
+          <w:szCs w:val="24"/>
+        </w:rPr>
+        <w:t xml:space="preserve"> is a modern deep learning architecture designed to improve the performance and efficiency of convolutional neural networks. Traditional CNN architectures often increase network depth or width to improve accuracy. </w:t>
+      </w:r>
+      <w:proofErr w:type="spellStart"/>
+      <w:r>
+        <w:rPr>
+          <w:rFonts w:ascii="Times New Roman" w:eastAsia="Times New Roman" w:hAnsi="Times New Roman" w:cs="Times New Roman"/>
+          <w:sz w:val="24"/>
+          <w:szCs w:val="24"/>
+        </w:rPr>
+        <w:t>EfficientNet</w:t>
+      </w:r>
+      <w:proofErr w:type="spellEnd"/>
+      <w:r>
+        <w:rPr>
+          <w:rFonts w:ascii="Times New Roman" w:eastAsia="Times New Roman" w:hAnsi="Times New Roman" w:cs="Times New Roman"/>
+          <w:sz w:val="24"/>
+          <w:szCs w:val="24"/>
+        </w:rPr>
+        <w:t xml:space="preserve"> introduces a compound scaling method that balances network depth, width, and input resolution to achieve better performance with fewer parameters.</w:t>
+      </w:r>
+    </w:p>
+    <w:p>
+      <w:pPr>
+        <w:spacing w:beforeAutospacing="1" w:afterAutospacing="1" w:line="240" w:lineRule="auto"/>
+        <w:jc w:val="both"/>
+        <w:rPr>
+          <w:rFonts w:ascii="Times New Roman" w:eastAsia="Times New Roman" w:hAnsi="Times New Roman" w:cs="Times New Roman"/>
+          <w:sz w:val="24"/>
+          <w:szCs w:val="24"/>
+        </w:rPr>
+      </w:pPr>
+      <w:r>
+        <w:rPr>
+          <w:rFonts w:ascii="Times New Roman" w:eastAsia="Times New Roman" w:hAnsi="Times New Roman" w:cs="Times New Roman"/>
+          <w:sz w:val="24"/>
+          <w:szCs w:val="24"/>
+        </w:rPr>
+        <w:t xml:space="preserve">This balanced scaling approach allows </w:t>
+      </w:r>
+      <w:proofErr w:type="spellStart"/>
+      <w:r>
+        <w:rPr>
+          <w:rFonts w:ascii="Times New Roman" w:eastAsia="Times New Roman" w:hAnsi="Times New Roman" w:cs="Times New Roman"/>
+          <w:sz w:val="24"/>
+          <w:szCs w:val="24"/>
+        </w:rPr>
+        <w:t>EfficientNet</w:t>
+      </w:r>
+      <w:proofErr w:type="spellEnd"/>
+      <w:r>
+        <w:rPr>
+          <w:rFonts w:ascii="Times New Roman" w:eastAsia="Times New Roman" w:hAnsi="Times New Roman" w:cs="Times New Roman"/>
+          <w:sz w:val="24"/>
+          <w:szCs w:val="24"/>
+        </w:rPr>
+        <w:t xml:space="preserve"> models to achieve high accuracy while maintaining computational efficiency. As a result, </w:t>
+      </w:r>
+      <w:proofErr w:type="spellStart"/>
+      <w:r>
+        <w:rPr>
+          <w:rFonts w:ascii="Times New Roman" w:eastAsia="Times New Roman" w:hAnsi="Times New Roman" w:cs="Times New Roman"/>
+          <w:sz w:val="24"/>
+          <w:szCs w:val="24"/>
+        </w:rPr>
+        <w:t>EfficientNet</w:t>
+      </w:r>
+      <w:proofErr w:type="spellEnd"/>
+      <w:r>
+        <w:rPr>
+          <w:rFonts w:ascii="Times New Roman" w:eastAsia="Times New Roman" w:hAnsi="Times New Roman" w:cs="Times New Roman"/>
+          <w:sz w:val="24"/>
+          <w:szCs w:val="24"/>
+        </w:rPr>
+        <w:t xml:space="preserve"> architectures are widely used in image classification tasks where both performance and computational efficiency are important.</w:t>
+      </w:r>
+    </w:p>
+    <w:p>
+      <w:pPr>
+        <w:spacing w:beforeAutospacing="1" w:afterAutospacing="1" w:line="240" w:lineRule="auto"/>
+        <w:jc w:val="both"/>
+        <w:rPr>
+          <w:rFonts w:ascii="Times New Roman" w:eastAsia="Times New Roman" w:hAnsi="Times New Roman" w:cs="Times New Roman"/>
+          <w:sz w:val="24"/>
+          <w:szCs w:val="24"/>
+        </w:rPr>
+      </w:pPr>
+      <w:proofErr w:type="spellStart"/>
+      <w:r>
+        <w:rPr>
+          <w:rFonts w:ascii="Times New Roman" w:eastAsia="Times New Roman" w:hAnsi="Times New Roman" w:cs="Times New Roman"/>
+          <w:sz w:val="24"/>
+          <w:szCs w:val="24"/>
+        </w:rPr>
+        <w:t>EfficientNet</w:t>
+      </w:r>
+      <w:proofErr w:type="spellEnd"/>
+      <w:r>
+        <w:rPr>
+          <w:rFonts w:ascii="Times New Roman" w:eastAsia="Times New Roman" w:hAnsi="Times New Roman" w:cs="Times New Roman"/>
+          <w:sz w:val="24"/>
+          <w:szCs w:val="24"/>
+        </w:rPr>
+        <w:t xml:space="preserve"> models have demonstrated strong performance in various computer vision applications, including plant disease detection, object recognition, and medical image analysis.</w:t>
       </w:r>
     </w:p>
     <w:p>
@@ -7740,7 +8013,27 @@
           <w:szCs w:val="24"/>
           <w:lang w:eastAsia="en-IN"/>
         </w:rPr>
-        <w:t>The study by Elbasi et al.</w:t>
+        <w:t xml:space="preserve">The study by </w:t>
+      </w:r>
+      <w:proofErr w:type="spellStart"/>
+      <w:r>
+        <w:rPr>
+          <w:rFonts w:ascii="Times New Roman" w:eastAsia="Times New Roman" w:hAnsi="Times New Roman" w:cs="Times New Roman"/>
+          <w:sz w:val="24"/>
+          <w:szCs w:val="24"/>
+          <w:lang w:eastAsia="en-IN"/>
+        </w:rPr>
+        <w:t>Elbasi</w:t>
+      </w:r>
+      <w:proofErr w:type="spellEnd"/>
+      <w:r>
+        <w:rPr>
+          <w:rFonts w:ascii="Times New Roman" w:eastAsia="Times New Roman" w:hAnsi="Times New Roman" w:cs="Times New Roman"/>
+          <w:sz w:val="24"/>
+          <w:szCs w:val="24"/>
+          <w:lang w:eastAsia="en-IN"/>
+        </w:rPr>
+        <w:t xml:space="preserve"> et al.</w:t>
       </w:r>
       <w:r>
         <w:rPr>
@@ -7776,7 +8069,27 @@
           <w:szCs w:val="24"/>
           <w:lang w:eastAsia="en-IN"/>
         </w:rPr>
-        <w:t>. Initially, noisy and mislabeled records are identified and removed to improve data reliability. The dataset is then balanced to ensure that each class label contains an equal number of samples, reducing bias during model training. To further enhance learning performance, the data records are randomly shuffled to provide a uniform distribution across the dataset. Feature selection is performed using correlation analysis to identify the most relevant attributes influencing agricultural outcomes. Additionally, new features are generated from existing attributes using statistical measures such as minimum, maximum, and range values to enrich the feature space. The dataset is then restructured into a consistent format and dimensionality reduction techniques are applied to eliminate redundant or less informative features.</w:t>
+        <w:t xml:space="preserve">. Initially, noisy and </w:t>
+      </w:r>
+      <w:proofErr w:type="spellStart"/>
+      <w:r>
+        <w:rPr>
+          <w:rFonts w:ascii="Times New Roman" w:eastAsia="Times New Roman" w:hAnsi="Times New Roman" w:cs="Times New Roman"/>
+          <w:sz w:val="24"/>
+          <w:szCs w:val="24"/>
+          <w:lang w:eastAsia="en-IN"/>
+        </w:rPr>
+        <w:t>mislabeled</w:t>
+      </w:r>
+      <w:proofErr w:type="spellEnd"/>
+      <w:r>
+        <w:rPr>
+          <w:rFonts w:ascii="Times New Roman" w:eastAsia="Times New Roman" w:hAnsi="Times New Roman" w:cs="Times New Roman"/>
+          <w:sz w:val="24"/>
+          <w:szCs w:val="24"/>
+          <w:lang w:eastAsia="en-IN"/>
+        </w:rPr>
+        <w:t xml:space="preserve"> records are identified and removed to improve data reliability. The dataset is then balanced to ensure that each class label contains an equal number of samples, reducing bias during model training. To further enhance learning performance, the data records are randomly shuffled to provide a uniform distribution across the dataset. Feature selection is performed using correlation analysis to identify the most relevant attributes influencing agricultural outcomes. Additionally, new features are generated from existing attributes using statistical measures such as minimum, maximum, and range values to enrich the feature space. The dataset is then restructured into a consistent format and dimensionality reduction techniques are applied to eliminate redundant or less informative features.</w:t>
       </w:r>
     </w:p>
     <w:p>
@@ -7833,7 +8146,47 @@
           <w:szCs w:val="24"/>
           <w:lang w:eastAsia="en-IN"/>
         </w:rPr>
-        <w:t>The dataset used for training and evaluation was the PlantVillage dataset, which contains more than 54,000 images of healthy and diseased plant leaves across 38 disease classes and multiple crop species. Prior to model training, several image preprocessing and augmentation techniques were applied, including rescaling pixel values, rotation, zooming, shearing, and horizontal flipping, in order to improve model generalization and reduce overfitting. Each CNN architecture was trained using softmax activation for multi-class classification and categorical cross-entropy as the loss function, optimized using the Adam optimizer. Experimental results showed that the individual models achieved high classification accuracy, with VGG16 reaching approximately 91.9% accuracy, VGG19 around 88.2%, InceptionV3 about 88%, and ResNet101V2 achieving approximately 93.6% accuracy.</w:t>
+        <w:t xml:space="preserve">The dataset used for training and evaluation was the </w:t>
+      </w:r>
+      <w:proofErr w:type="spellStart"/>
+      <w:r>
+        <w:rPr>
+          <w:rFonts w:ascii="Times New Roman" w:eastAsia="Times New Roman" w:hAnsi="Times New Roman" w:cs="Times New Roman"/>
+          <w:sz w:val="24"/>
+          <w:szCs w:val="24"/>
+          <w:lang w:eastAsia="en-IN"/>
+        </w:rPr>
+        <w:t>PlantVillage</w:t>
+      </w:r>
+      <w:proofErr w:type="spellEnd"/>
+      <w:r>
+        <w:rPr>
+          <w:rFonts w:ascii="Times New Roman" w:eastAsia="Times New Roman" w:hAnsi="Times New Roman" w:cs="Times New Roman"/>
+          <w:sz w:val="24"/>
+          <w:szCs w:val="24"/>
+          <w:lang w:eastAsia="en-IN"/>
+        </w:rPr>
+        <w:t xml:space="preserve"> dataset, which contains more than 54,000 images of healthy and diseased plant leaves across 38 disease classes and multiple crop species. Prior to model training, several image preprocessing and augmentation techniques were applied, including rescaling pixel values, rotation, zooming, shearing, and horizontal flipping, in order to improve model generalization and reduce overfitting. Each CNN architecture was trained using </w:t>
+      </w:r>
+      <w:proofErr w:type="spellStart"/>
+      <w:r>
+        <w:rPr>
+          <w:rFonts w:ascii="Times New Roman" w:eastAsia="Times New Roman" w:hAnsi="Times New Roman" w:cs="Times New Roman"/>
+          <w:sz w:val="24"/>
+          <w:szCs w:val="24"/>
+          <w:lang w:eastAsia="en-IN"/>
+        </w:rPr>
+        <w:t>softmax</w:t>
+      </w:r>
+      <w:proofErr w:type="spellEnd"/>
+      <w:r>
+        <w:rPr>
+          <w:rFonts w:ascii="Times New Roman" w:eastAsia="Times New Roman" w:hAnsi="Times New Roman" w:cs="Times New Roman"/>
+          <w:sz w:val="24"/>
+          <w:szCs w:val="24"/>
+          <w:lang w:eastAsia="en-IN"/>
+        </w:rPr>
+        <w:t xml:space="preserve"> activation for multi-class classification and categorical cross-entropy as the loss function, optimized using the Adam optimizer. Experimental results showed that the individual models achieved high classification accuracy, with VGG16 reaching approximately 91.9% accuracy, VGG19 around 88.2%, InceptionV3 about 88%, and ResNet101V2 achieving approximately 93.6% accuracy.</w:t>
       </w:r>
     </w:p>
     <w:p>
@@ -7873,7 +8226,87 @@
           <w:szCs w:val="24"/>
           <w:lang w:eastAsia="en-IN"/>
         </w:rPr>
-        <w:t xml:space="preserve">. To overcome these issues, the authors introduced a hybrid approach combining Generative Adversarial Networks (GANs) and Vision Transformer (ViT) models for accurate growth stage recognition. In the proposed methodology, the StyleGAN3 architecture is used to generate high-quality synthetic images of tomato plants at different growth stages. These generated images are combined with real images to augment the dataset, thereby increasing the diversity of training data and reducing the impact of limited sample availability in agricultural datasets. After dataset augmentation, the classification of tomato growth stages is performed using the Vision Transformer (ViT) model, a deep learning architecture that utilizes a self-attention mechanism to capture global relationships within image features. Unlike traditional Convolutional Neural Networks (CNNs), the ViT model processes images as sequences of patches and analyzes long-range dependencies between them, enabling improved recognition of complex visual patterns associated with plant growth stages. The model was trained on a dataset consisting of 2723 images of tomato plants across multiple growth phases, including sapling, flowering, fruiting, and maturity stages. The combined dataset containing both real and GAN-generated images significantly enhanced model performance compared to training with only original images. Experimental evaluation demonstrated that the proposed approach achieved highly accurate recognition results. </w:t>
+        <w:t>. To overcome these issues, the authors introduced a hybrid approach combining Generative Adversarial Networks (GANs) and Vision Transformer (</w:t>
+      </w:r>
+      <w:proofErr w:type="spellStart"/>
+      <w:r>
+        <w:rPr>
+          <w:rFonts w:ascii="Times New Roman" w:eastAsia="Times New Roman" w:hAnsi="Times New Roman" w:cs="Times New Roman"/>
+          <w:sz w:val="24"/>
+          <w:szCs w:val="24"/>
+          <w:lang w:eastAsia="en-IN"/>
+        </w:rPr>
+        <w:t>ViT</w:t>
+      </w:r>
+      <w:proofErr w:type="spellEnd"/>
+      <w:r>
+        <w:rPr>
+          <w:rFonts w:ascii="Times New Roman" w:eastAsia="Times New Roman" w:hAnsi="Times New Roman" w:cs="Times New Roman"/>
+          <w:sz w:val="24"/>
+          <w:szCs w:val="24"/>
+          <w:lang w:eastAsia="en-IN"/>
+        </w:rPr>
+        <w:t>) models for accurate growth stage recognition. In the proposed methodology, the StyleGAN3 architecture is used to generate high-quality synthetic images of tomato plants at different growth stages. These generated images are combined with real images to augment the dataset, thereby increasing the diversity of training data and reducing the impact of limited sample availability in agricultural datasets. After dataset augmentation, the classification of tomato growth stages is performed using the Vision Transformer (</w:t>
+      </w:r>
+      <w:proofErr w:type="spellStart"/>
+      <w:r>
+        <w:rPr>
+          <w:rFonts w:ascii="Times New Roman" w:eastAsia="Times New Roman" w:hAnsi="Times New Roman" w:cs="Times New Roman"/>
+          <w:sz w:val="24"/>
+          <w:szCs w:val="24"/>
+          <w:lang w:eastAsia="en-IN"/>
+        </w:rPr>
+        <w:t>ViT</w:t>
+      </w:r>
+      <w:proofErr w:type="spellEnd"/>
+      <w:r>
+        <w:rPr>
+          <w:rFonts w:ascii="Times New Roman" w:eastAsia="Times New Roman" w:hAnsi="Times New Roman" w:cs="Times New Roman"/>
+          <w:sz w:val="24"/>
+          <w:szCs w:val="24"/>
+          <w:lang w:eastAsia="en-IN"/>
+        </w:rPr>
+        <w:t xml:space="preserve">) model, a deep learning architecture that utilizes a self-attention mechanism to capture global relationships within image features. Unlike traditional Convolutional Neural Networks (CNNs), the </w:t>
+      </w:r>
+      <w:proofErr w:type="spellStart"/>
+      <w:r>
+        <w:rPr>
+          <w:rFonts w:ascii="Times New Roman" w:eastAsia="Times New Roman" w:hAnsi="Times New Roman" w:cs="Times New Roman"/>
+          <w:sz w:val="24"/>
+          <w:szCs w:val="24"/>
+          <w:lang w:eastAsia="en-IN"/>
+        </w:rPr>
+        <w:t>ViT</w:t>
+      </w:r>
+      <w:proofErr w:type="spellEnd"/>
+      <w:r>
+        <w:rPr>
+          <w:rFonts w:ascii="Times New Roman" w:eastAsia="Times New Roman" w:hAnsi="Times New Roman" w:cs="Times New Roman"/>
+          <w:sz w:val="24"/>
+          <w:szCs w:val="24"/>
+          <w:lang w:eastAsia="en-IN"/>
+        </w:rPr>
+        <w:t xml:space="preserve"> model processes images as sequences of patches and </w:t>
+      </w:r>
+      <w:proofErr w:type="spellStart"/>
+      <w:r>
+        <w:rPr>
+          <w:rFonts w:ascii="Times New Roman" w:eastAsia="Times New Roman" w:hAnsi="Times New Roman" w:cs="Times New Roman"/>
+          <w:sz w:val="24"/>
+          <w:szCs w:val="24"/>
+          <w:lang w:eastAsia="en-IN"/>
+        </w:rPr>
+        <w:t>analyzes</w:t>
+      </w:r>
+      <w:proofErr w:type="spellEnd"/>
+      <w:r>
+        <w:rPr>
+          <w:rFonts w:ascii="Times New Roman" w:eastAsia="Times New Roman" w:hAnsi="Times New Roman" w:cs="Times New Roman"/>
+          <w:sz w:val="24"/>
+          <w:szCs w:val="24"/>
+          <w:lang w:eastAsia="en-IN"/>
+        </w:rPr>
+        <w:t xml:space="preserve"> long-range dependencies between them, enabling improved recognition of complex visual patterns associated with plant growth stages. The model was trained on a dataset consisting of 2723 images of tomato plants across multiple growth phases, including sapling, flowering, fruiting, and maturity stages. The combined dataset containing both real and GAN-generated images significantly enhanced model performance compared to training with only original images. Experimental evaluation demonstrated that the proposed approach achieved highly accurate recognition results. </w:t>
       </w:r>
     </w:p>
     <w:p>
@@ -7941,49 +8374,109 @@
           <w:szCs w:val="24"/>
           <w:lang w:eastAsia="en-IN"/>
         </w:rPr>
-        <w:t>The literature review indicates that effective data preprocessing plays a critical role in improving the performance of machine learning models in agricultural applications. Previous studies have focused on preprocessing techniques such as noise removal, dataset balancing, feature selection, and statistical feature generation to transform raw agricultural data into structured datasets suitable for machine learning models. However, these approaches mainly focus on preparing datasets for model training rather than developing a comprehensive environmental data processing pipeline. In contrast, the proposed AgriTwin-GH framework implements a unified greenhouse data processing architecture that integrates multi-source environmental data ingestion, temporal synchronization, and environmental feature engineering to generate standardized datasets suitable for intelligent greenhouse analysis.</w:t>
-      </w:r>
-    </w:p>
-    <w:p>
-      <w:pPr>
-        <w:spacing w:beforeAutospacing="1" w:afterAutospacing="1" w:line="240" w:lineRule="auto"/>
-        <w:jc w:val="both"/>
-        <w:rPr>
-          <w:rFonts w:ascii="Times New Roman" w:eastAsia="Times New Roman" w:hAnsi="Times New Roman" w:cs="Times New Roman"/>
-          <w:sz w:val="24"/>
-          <w:szCs w:val="24"/>
-          <w:lang w:eastAsia="en-IN"/>
-        </w:rPr>
-      </w:pPr>
-      <w:r>
-        <w:rPr>
-          <w:rFonts w:ascii="Times New Roman" w:eastAsia="Times New Roman" w:hAnsi="Times New Roman" w:cs="Times New Roman"/>
-          <w:sz w:val="24"/>
-          <w:szCs w:val="24"/>
-          <w:lang w:eastAsia="en-IN"/>
-        </w:rPr>
-        <w:t>Existing research on plant disease detection has demonstrated that deep learning architectures, particularly convolutional neural networks and ensemble learning models, can achieve high accuracy in leaf disease classification tasks. Methods combining multiple CNN architectures and ensemble voting strategies have improved prediction robustness by leveraging complementary feature extraction capabilities of different models. Nevertheless, such approaches often involve high computational complexity and limited interpretability when deployed in real-world greenhouse monitoring systems. In the proposed system, disease detection is implemented using an EfficientNet-based deep learning model that provides high classification accuracy while maintaining computational efficiency suitable for real-time greenhouse monitoring environments.</w:t>
-      </w:r>
-    </w:p>
-    <w:p>
-      <w:pPr>
-        <w:spacing w:beforeAutospacing="1" w:afterAutospacing="1" w:line="240" w:lineRule="auto"/>
-        <w:jc w:val="both"/>
-        <w:rPr>
-          <w:rFonts w:ascii="Times New Roman" w:eastAsia="Times New Roman" w:hAnsi="Times New Roman" w:cs="Times New Roman"/>
-          <w:sz w:val="24"/>
-          <w:szCs w:val="24"/>
-          <w:lang w:eastAsia="en-IN"/>
-        </w:rPr>
-      </w:pPr>
-      <w:r>
-        <w:rPr>
-          <w:rFonts w:ascii="Times New Roman" w:eastAsia="Times New Roman" w:hAnsi="Times New Roman" w:cs="Times New Roman"/>
-          <w:sz w:val="24"/>
-          <w:szCs w:val="24"/>
-          <w:lang w:eastAsia="en-IN"/>
-        </w:rPr>
-        <w:t xml:space="preserve">For tomato growth stage recognition, several studies have explored complex architectures such as transformer-based models and generative adversarial networks for improving classification performance. In contrast, the proposed work adopts an EfficientNet-based deep convolutional neural network architecture optimized for agricultural image analysis, enabling highly efficient </w:t>
+        <w:t xml:space="preserve">The literature review indicates that effective data preprocessing plays a critical role in improving the performance of machine learning models in agricultural applications. Previous studies have focused on preprocessing techniques such as noise removal, dataset balancing, feature selection, and statistical feature generation to transform raw agricultural data into structured datasets suitable for machine learning models. However, these approaches mainly focus on preparing datasets for model training rather than developing a comprehensive environmental data processing pipeline. In contrast, the proposed </w:t>
+      </w:r>
+      <w:proofErr w:type="spellStart"/>
+      <w:r>
+        <w:rPr>
+          <w:rFonts w:ascii="Times New Roman" w:eastAsia="Times New Roman" w:hAnsi="Times New Roman" w:cs="Times New Roman"/>
+          <w:sz w:val="24"/>
+          <w:szCs w:val="24"/>
+          <w:lang w:eastAsia="en-IN"/>
+        </w:rPr>
+        <w:t>AgriTwin</w:t>
+      </w:r>
+      <w:proofErr w:type="spellEnd"/>
+      <w:r>
+        <w:rPr>
+          <w:rFonts w:ascii="Times New Roman" w:eastAsia="Times New Roman" w:hAnsi="Times New Roman" w:cs="Times New Roman"/>
+          <w:sz w:val="24"/>
+          <w:szCs w:val="24"/>
+          <w:lang w:eastAsia="en-IN"/>
+        </w:rPr>
+        <w:t>-GH framework implements a unified greenhouse data processing architecture that integrates multi-source environmental data ingestion, temporal synchronization, and environmental feature engineering to generate standardized datasets suitable for intelligent greenhouse analysis.</w:t>
+      </w:r>
+    </w:p>
+    <w:p>
+      <w:pPr>
+        <w:spacing w:beforeAutospacing="1" w:afterAutospacing="1" w:line="240" w:lineRule="auto"/>
+        <w:jc w:val="both"/>
+        <w:rPr>
+          <w:rFonts w:ascii="Times New Roman" w:eastAsia="Times New Roman" w:hAnsi="Times New Roman" w:cs="Times New Roman"/>
+          <w:sz w:val="24"/>
+          <w:szCs w:val="24"/>
+          <w:lang w:eastAsia="en-IN"/>
+        </w:rPr>
+      </w:pPr>
+      <w:r>
+        <w:rPr>
+          <w:rFonts w:ascii="Times New Roman" w:eastAsia="Times New Roman" w:hAnsi="Times New Roman" w:cs="Times New Roman"/>
+          <w:sz w:val="24"/>
+          <w:szCs w:val="24"/>
+          <w:lang w:eastAsia="en-IN"/>
+        </w:rPr>
+        <w:t xml:space="preserve">Existing research on plant disease detection has demonstrated that deep learning architectures, particularly convolutional neural networks and ensemble learning models, can achieve high accuracy in leaf disease classification tasks. Methods combining multiple CNN architectures and ensemble voting strategies have improved prediction robustness by leveraging complementary feature extraction capabilities of different models. Nevertheless, such approaches often involve high computational complexity and limited interpretability when deployed in real-world greenhouse monitoring systems. In the proposed system, disease detection is implemented using an </w:t>
+      </w:r>
+      <w:proofErr w:type="spellStart"/>
+      <w:r>
+        <w:rPr>
+          <w:rFonts w:ascii="Times New Roman" w:eastAsia="Times New Roman" w:hAnsi="Times New Roman" w:cs="Times New Roman"/>
+          <w:sz w:val="24"/>
+          <w:szCs w:val="24"/>
+          <w:lang w:eastAsia="en-IN"/>
+        </w:rPr>
+        <w:t>EfficientNet</w:t>
+      </w:r>
+      <w:proofErr w:type="spellEnd"/>
+      <w:r>
+        <w:rPr>
+          <w:rFonts w:ascii="Times New Roman" w:eastAsia="Times New Roman" w:hAnsi="Times New Roman" w:cs="Times New Roman"/>
+          <w:sz w:val="24"/>
+          <w:szCs w:val="24"/>
+          <w:lang w:eastAsia="en-IN"/>
+        </w:rPr>
+        <w:t>-based deep learning model that provides high classification accuracy while maintaining computational efficiency suitable for real-time greenhouse monitoring environments.</w:t>
+      </w:r>
+    </w:p>
+    <w:p>
+      <w:pPr>
+        <w:spacing w:beforeAutospacing="1" w:afterAutospacing="1" w:line="240" w:lineRule="auto"/>
+        <w:jc w:val="both"/>
+        <w:rPr>
+          <w:rFonts w:ascii="Times New Roman" w:eastAsia="Times New Roman" w:hAnsi="Times New Roman" w:cs="Times New Roman"/>
+          <w:sz w:val="24"/>
+          <w:szCs w:val="24"/>
+          <w:lang w:eastAsia="en-IN"/>
+        </w:rPr>
+      </w:pPr>
+      <w:r>
+        <w:rPr>
+          <w:rFonts w:ascii="Times New Roman" w:eastAsia="Times New Roman" w:hAnsi="Times New Roman" w:cs="Times New Roman"/>
+          <w:sz w:val="24"/>
+          <w:szCs w:val="24"/>
+          <w:lang w:eastAsia="en-IN"/>
+        </w:rPr>
+        <w:t xml:space="preserve">For tomato growth stage recognition, several studies have explored complex architectures such as transformer-based models and generative adversarial networks for improving classification performance. In contrast, the proposed work adopts an </w:t>
+      </w:r>
+      <w:proofErr w:type="spellStart"/>
+      <w:r>
+        <w:rPr>
+          <w:rFonts w:ascii="Times New Roman" w:eastAsia="Times New Roman" w:hAnsi="Times New Roman" w:cs="Times New Roman"/>
+          <w:sz w:val="24"/>
+          <w:szCs w:val="24"/>
+          <w:lang w:eastAsia="en-IN"/>
+        </w:rPr>
+        <w:t>EfficientNet</w:t>
+      </w:r>
+      <w:proofErr w:type="spellEnd"/>
+      <w:r>
+        <w:rPr>
+          <w:rFonts w:ascii="Times New Roman" w:eastAsia="Times New Roman" w:hAnsi="Times New Roman" w:cs="Times New Roman"/>
+          <w:sz w:val="24"/>
+          <w:szCs w:val="24"/>
+          <w:lang w:eastAsia="en-IN"/>
+        </w:rPr>
+        <w:t xml:space="preserve">-based deep convolutional neural network architecture optimized for agricultural image analysis, enabling highly efficient </w:t>
       </w:r>
       <w:r>
         <w:rPr>
@@ -7993,7 +8486,27 @@
           <w:lang w:eastAsia="en-IN"/>
         </w:rPr>
         <w:lastRenderedPageBreak/>
-        <w:t>feature extraction with reduced computational overhead. The EfficientNet model leverages compound scaling of network depth, width, and resolution to capture detailed morphological characteristics of tomato plants across different growth phases, resulting in improved classification accuracy and robust growth stage prediction suitable for intelligent greenhouse monitoring systems.</w:t>
+        <w:t xml:space="preserve">feature extraction with reduced computational overhead. The </w:t>
+      </w:r>
+      <w:proofErr w:type="spellStart"/>
+      <w:r>
+        <w:rPr>
+          <w:rFonts w:ascii="Times New Roman" w:eastAsia="Times New Roman" w:hAnsi="Times New Roman" w:cs="Times New Roman"/>
+          <w:sz w:val="24"/>
+          <w:szCs w:val="24"/>
+          <w:lang w:eastAsia="en-IN"/>
+        </w:rPr>
+        <w:t>EfficientNet</w:t>
+      </w:r>
+      <w:proofErr w:type="spellEnd"/>
+      <w:r>
+        <w:rPr>
+          <w:rFonts w:ascii="Times New Roman" w:eastAsia="Times New Roman" w:hAnsi="Times New Roman" w:cs="Times New Roman"/>
+          <w:sz w:val="24"/>
+          <w:szCs w:val="24"/>
+          <w:lang w:eastAsia="en-IN"/>
+        </w:rPr>
+        <w:t xml:space="preserve"> model leverages compound scaling of network depth, width, and resolution to capture detailed morphological characteristics of tomato plants across different growth phases, resulting in improved classification accuracy and robust growth stage prediction suitable for intelligent greenhouse monitoring systems.</w:t>
       </w:r>
     </w:p>
     <w:p>
@@ -8079,7 +8592,27 @@
           <w:szCs w:val="24"/>
           <w:lang w:eastAsia="en-IN"/>
         </w:rPr>
-        <w:t>.1 illustrates the high-level architecture of the proposed AgriTwin-GH framework, depicting the flow of data from input acquisition to intelligent decision outputs. The architecture is structured into three primary layers: input data sources, core processing modules, and system outputs.</w:t>
+        <w:t xml:space="preserve">.1 illustrates the high-level architecture of the proposed </w:t>
+      </w:r>
+      <w:proofErr w:type="spellStart"/>
+      <w:r>
+        <w:rPr>
+          <w:rFonts w:ascii="Times New Roman" w:eastAsia="Times New Roman" w:hAnsi="Times New Roman" w:cs="Times New Roman"/>
+          <w:sz w:val="24"/>
+          <w:szCs w:val="24"/>
+          <w:lang w:eastAsia="en-IN"/>
+        </w:rPr>
+        <w:t>AgriTwin</w:t>
+      </w:r>
+      <w:proofErr w:type="spellEnd"/>
+      <w:r>
+        <w:rPr>
+          <w:rFonts w:ascii="Times New Roman" w:eastAsia="Times New Roman" w:hAnsi="Times New Roman" w:cs="Times New Roman"/>
+          <w:sz w:val="24"/>
+          <w:szCs w:val="24"/>
+          <w:lang w:eastAsia="en-IN"/>
+        </w:rPr>
+        <w:t>-GH framework, depicting the flow of data from input acquisition to intelligent decision outputs. The architecture is structured into three primary layers: input data sources, core processing modules, and system outputs.</w:t>
       </w:r>
     </w:p>
     <w:p>
@@ -8196,7 +8729,27 @@
           <w:szCs w:val="20"/>
           <w:lang w:eastAsia="en-IN"/>
         </w:rPr>
-        <w:t>of AgriTwin-GH</w:t>
+        <w:t xml:space="preserve">of </w:t>
+      </w:r>
+      <w:proofErr w:type="spellStart"/>
+      <w:r>
+        <w:rPr>
+          <w:rFonts w:ascii="Times New Roman" w:eastAsia="Times New Roman" w:hAnsi="Times New Roman" w:cs="Times New Roman"/>
+          <w:sz w:val="20"/>
+          <w:szCs w:val="20"/>
+          <w:lang w:eastAsia="en-IN"/>
+        </w:rPr>
+        <w:t>AgriTwin</w:t>
+      </w:r>
+      <w:proofErr w:type="spellEnd"/>
+      <w:r>
+        <w:rPr>
+          <w:rFonts w:ascii="Times New Roman" w:eastAsia="Times New Roman" w:hAnsi="Times New Roman" w:cs="Times New Roman"/>
+          <w:sz w:val="20"/>
+          <w:szCs w:val="20"/>
+          <w:lang w:eastAsia="en-IN"/>
+        </w:rPr>
+        <w:t>-GH</w:t>
       </w:r>
     </w:p>
     <w:p>
@@ -8285,7 +8838,25 @@
           <w:sz w:val="24"/>
           <w:szCs w:val="24"/>
         </w:rPr>
-        <w:t>The proposed system operates using data-driven inputs obtained from open-source datasets that emulate real greenhouse environments. These datasets act as virtual sensors, enabling experimentation and analysis without relying on physical sensor infrastructure, while still reflecting realistic greenhouse behavior.</w:t>
+        <w:t xml:space="preserve">The proposed system operates using data-driven inputs obtained from open-source datasets that emulate real greenhouse environments. These datasets act as virtual sensors, enabling experimentation and analysis without relying on physical sensor infrastructure, while still reflecting realistic greenhouse </w:t>
+      </w:r>
+      <w:proofErr w:type="spellStart"/>
+      <w:r>
+        <w:rPr>
+          <w:rFonts w:ascii="Times New Roman" w:eastAsia="Times New Roman" w:hAnsi="Times New Roman" w:cs="Times New Roman"/>
+          <w:sz w:val="24"/>
+          <w:szCs w:val="24"/>
+        </w:rPr>
+        <w:t>behavior</w:t>
+      </w:r>
+      <w:proofErr w:type="spellEnd"/>
+      <w:r>
+        <w:rPr>
+          <w:rFonts w:ascii="Times New Roman" w:eastAsia="Times New Roman" w:hAnsi="Times New Roman" w:cs="Times New Roman"/>
+          <w:sz w:val="24"/>
+          <w:szCs w:val="24"/>
+        </w:rPr>
+        <w:t>.</w:t>
       </w:r>
     </w:p>
     <w:p>
@@ -8335,7 +8906,25 @@
           <w:sz w:val="24"/>
           <w:szCs w:val="24"/>
         </w:rPr>
-        <w:t xml:space="preserve">The environmental dataset used in this study is derived from real-world weather observations collected for the Dindigul district of Tamil Nadu, India. The weather data for the years 2024 </w:t>
+        <w:t xml:space="preserve">The environmental dataset used in this study is derived from real-world weather observations collected for the </w:t>
+      </w:r>
+      <w:proofErr w:type="spellStart"/>
+      <w:r>
+        <w:rPr>
+          <w:rFonts w:ascii="Times New Roman" w:eastAsia="Times New Roman" w:hAnsi="Times New Roman" w:cs="Times New Roman"/>
+          <w:sz w:val="24"/>
+          <w:szCs w:val="24"/>
+        </w:rPr>
+        <w:t>Dindigul</w:t>
+      </w:r>
+      <w:proofErr w:type="spellEnd"/>
+      <w:r>
+        <w:rPr>
+          <w:rFonts w:ascii="Times New Roman" w:eastAsia="Times New Roman" w:hAnsi="Times New Roman" w:cs="Times New Roman"/>
+          <w:sz w:val="24"/>
+          <w:szCs w:val="24"/>
+        </w:rPr>
+        <w:t xml:space="preserve"> district of Tamil Nadu, India. The weather data for the years 2024 </w:t>
       </w:r>
       <w:r>
         <w:rPr>
@@ -8363,7 +8952,25 @@
           <w:sz w:val="24"/>
           <w:szCs w:val="24"/>
         </w:rPr>
-        <w:t>Using this real-world weather data as the foundation, an indoor greenhouse environmental dataset was generated to simulate greenhouse conditions. The derived dataset represents indoor greenhouse parameters influenced by the outdoor climate and includes variables such as indoor temperature, humidity, air velocity, solar radiation, carbon dioxide concentration, vapor pressure deficit, and leaf wetness indicators. Both the original API-based weather dataset and the generated indoor greenhouse dataset are utilized as environmental inputs for further analysis and system modeling.</w:t>
+        <w:t xml:space="preserve">Using this real-world weather data as the foundation, an indoor greenhouse environmental dataset was generated to simulate greenhouse conditions. The derived dataset represents indoor greenhouse parameters influenced by the outdoor climate and includes variables such as indoor temperature, humidity, air velocity, solar radiation, carbon dioxide concentration, vapor pressure deficit, and leaf wetness indicators. Both the original API-based weather dataset and the generated indoor greenhouse dataset are utilized as environmental inputs for further analysis and system </w:t>
+      </w:r>
+      <w:proofErr w:type="spellStart"/>
+      <w:r>
+        <w:rPr>
+          <w:rFonts w:ascii="Times New Roman" w:eastAsia="Times New Roman" w:hAnsi="Times New Roman" w:cs="Times New Roman"/>
+          <w:sz w:val="24"/>
+          <w:szCs w:val="24"/>
+        </w:rPr>
+        <w:t>modeling</w:t>
+      </w:r>
+      <w:proofErr w:type="spellEnd"/>
+      <w:r>
+        <w:rPr>
+          <w:rFonts w:ascii="Times New Roman" w:eastAsia="Times New Roman" w:hAnsi="Times New Roman" w:cs="Times New Roman"/>
+          <w:sz w:val="24"/>
+          <w:szCs w:val="24"/>
+        </w:rPr>
+        <w:t>.</w:t>
       </w:r>
     </w:p>
     <w:p>
@@ -8693,7 +9300,47 @@
           <w:szCs w:val="24"/>
           <w:lang w:eastAsia="en-IN"/>
         </w:rPr>
-        <w:t xml:space="preserve">The proposed AgriTwin-GH system is organized into multiple functional modules that collectively enable intelligent greenhouse monitoring, predictive crop analysis, and automated decision support. Each module performs a specific set of operations within the system workflow, beginning from data processing and crop analysis to predictive modeling and digital twin–based greenhouse control. The modular architecture allows the system to process </w:t>
+        <w:t xml:space="preserve">The proposed </w:t>
+      </w:r>
+      <w:proofErr w:type="spellStart"/>
+      <w:r>
+        <w:rPr>
+          <w:rFonts w:ascii="Times New Roman" w:eastAsia="Times New Roman" w:hAnsi="Times New Roman" w:cs="Times New Roman"/>
+          <w:sz w:val="24"/>
+          <w:szCs w:val="24"/>
+          <w:lang w:eastAsia="en-IN"/>
+        </w:rPr>
+        <w:t>AgriTwin</w:t>
+      </w:r>
+      <w:proofErr w:type="spellEnd"/>
+      <w:r>
+        <w:rPr>
+          <w:rFonts w:ascii="Times New Roman" w:eastAsia="Times New Roman" w:hAnsi="Times New Roman" w:cs="Times New Roman"/>
+          <w:sz w:val="24"/>
+          <w:szCs w:val="24"/>
+          <w:lang w:eastAsia="en-IN"/>
+        </w:rPr>
+        <w:t xml:space="preserve">-GH system is organized into multiple functional modules that collectively enable intelligent greenhouse monitoring, predictive crop analysis, and automated decision support. Each module performs a specific set of operations within the system workflow, beginning from data processing and crop analysis to predictive </w:t>
+      </w:r>
+      <w:proofErr w:type="spellStart"/>
+      <w:r>
+        <w:rPr>
+          <w:rFonts w:ascii="Times New Roman" w:eastAsia="Times New Roman" w:hAnsi="Times New Roman" w:cs="Times New Roman"/>
+          <w:sz w:val="24"/>
+          <w:szCs w:val="24"/>
+          <w:lang w:eastAsia="en-IN"/>
+        </w:rPr>
+        <w:t>modeling</w:t>
+      </w:r>
+      <w:proofErr w:type="spellEnd"/>
+      <w:r>
+        <w:rPr>
+          <w:rFonts w:ascii="Times New Roman" w:eastAsia="Times New Roman" w:hAnsi="Times New Roman" w:cs="Times New Roman"/>
+          <w:sz w:val="24"/>
+          <w:szCs w:val="24"/>
+          <w:lang w:eastAsia="en-IN"/>
+        </w:rPr>
+        <w:t xml:space="preserve"> and digital twin–based greenhouse control. The modular architecture allows the system to process </w:t>
       </w:r>
       <w:r>
         <w:rPr>
@@ -8817,7 +9464,27 @@
           <w:szCs w:val="24"/>
           <w:lang w:eastAsia="en-IN"/>
         </w:rPr>
-        <w:t xml:space="preserve"> illustrates the task-level decomposition of the Data Processing and AI-Based Crop Intelligence Module in the AgriTwin-GH system. It shows how environmental and plant image data are processed to perform data preparation, crop growth stage classification, and plant disease detection.</w:t>
+        <w:t xml:space="preserve"> illustrates the task-level decomposition of the Data Processing and AI-Based Crop Intelligence Module in the </w:t>
+      </w:r>
+      <w:proofErr w:type="spellStart"/>
+      <w:r>
+        <w:rPr>
+          <w:rFonts w:ascii="Times New Roman" w:eastAsia="Times New Roman" w:hAnsi="Times New Roman" w:cs="Times New Roman"/>
+          <w:sz w:val="24"/>
+          <w:szCs w:val="24"/>
+          <w:lang w:eastAsia="en-IN"/>
+        </w:rPr>
+        <w:t>AgriTwin</w:t>
+      </w:r>
+      <w:proofErr w:type="spellEnd"/>
+      <w:r>
+        <w:rPr>
+          <w:rFonts w:ascii="Times New Roman" w:eastAsia="Times New Roman" w:hAnsi="Times New Roman" w:cs="Times New Roman"/>
+          <w:sz w:val="24"/>
+          <w:szCs w:val="24"/>
+          <w:lang w:eastAsia="en-IN"/>
+        </w:rPr>
+        <w:t>-GH system. It shows how environmental and plant image data are processed to perform data preparation, crop growth stage classification, and plant disease detection.</w:t>
       </w:r>
     </w:p>
     <w:p>
@@ -9041,7 +9708,27 @@
           <w:lang w:eastAsia="en-IN"/>
         </w:rPr>
         <w:lastRenderedPageBreak/>
-        <w:t>generate derived environmental indicators that support further crop analysis and predictive modeling processes.</w:t>
+        <w:t xml:space="preserve">generate derived environmental indicators that support further crop analysis and predictive </w:t>
+      </w:r>
+      <w:proofErr w:type="spellStart"/>
+      <w:r>
+        <w:rPr>
+          <w:rFonts w:ascii="Times New Roman" w:eastAsia="Times New Roman" w:hAnsi="Times New Roman" w:cs="Times New Roman"/>
+          <w:sz w:val="24"/>
+          <w:szCs w:val="24"/>
+          <w:lang w:eastAsia="en-IN"/>
+        </w:rPr>
+        <w:t>modeling</w:t>
+      </w:r>
+      <w:proofErr w:type="spellEnd"/>
+      <w:r>
+        <w:rPr>
+          <w:rFonts w:ascii="Times New Roman" w:eastAsia="Times New Roman" w:hAnsi="Times New Roman" w:cs="Times New Roman"/>
+          <w:sz w:val="24"/>
+          <w:szCs w:val="24"/>
+          <w:lang w:eastAsia="en-IN"/>
+        </w:rPr>
+        <w:t xml:space="preserve"> processes.</w:t>
       </w:r>
     </w:p>
     <w:p>
@@ -9098,7 +9785,47 @@
           <w:szCs w:val="24"/>
           <w:lang w:eastAsia="en-IN"/>
         </w:rPr>
-        <w:t>The crop growth stage classification task focuses on identifying the current development stage of tomato plants using image-based deep learning models. Recognizing plant growth stages is important for monitoring crop development and determining appropriate cultivation actions during different phases of the plant lifecycle. In this task, plant images are first preprocessed to ensure consistent input quality for the deep learning model. A convolutional neural network is then used to analyze visual patterns in the plant images and classify the corresponding growth stage. The model generates probability scores representing the likelihood of different growth stages, allowing accurate identification of plant development phases. Model fine-tuning is performed using greenhouse crop image datasets to improve classification accuracy under varying environmental conditions.</w:t>
+        <w:t xml:space="preserve">The crop growth stage classification task focuses on identifying the current development stage of tomato plants using image-based deep learning models. Recognizing plant growth stages is important for monitoring crop development and determining appropriate cultivation actions during different phases of the plant lifecycle. In this task, plant images are first </w:t>
+      </w:r>
+      <w:proofErr w:type="spellStart"/>
+      <w:r>
+        <w:rPr>
+          <w:rFonts w:ascii="Times New Roman" w:eastAsia="Times New Roman" w:hAnsi="Times New Roman" w:cs="Times New Roman"/>
+          <w:sz w:val="24"/>
+          <w:szCs w:val="24"/>
+          <w:lang w:eastAsia="en-IN"/>
+        </w:rPr>
+        <w:t>preprocessed</w:t>
+      </w:r>
+      <w:proofErr w:type="spellEnd"/>
+      <w:r>
+        <w:rPr>
+          <w:rFonts w:ascii="Times New Roman" w:eastAsia="Times New Roman" w:hAnsi="Times New Roman" w:cs="Times New Roman"/>
+          <w:sz w:val="24"/>
+          <w:szCs w:val="24"/>
+          <w:lang w:eastAsia="en-IN"/>
+        </w:rPr>
+        <w:t xml:space="preserve"> to ensure consistent input quality for the deep learning model. A convolutional neural network is then used to </w:t>
+      </w:r>
+      <w:proofErr w:type="spellStart"/>
+      <w:r>
+        <w:rPr>
+          <w:rFonts w:ascii="Times New Roman" w:eastAsia="Times New Roman" w:hAnsi="Times New Roman" w:cs="Times New Roman"/>
+          <w:sz w:val="24"/>
+          <w:szCs w:val="24"/>
+          <w:lang w:eastAsia="en-IN"/>
+        </w:rPr>
+        <w:t>analyze</w:t>
+      </w:r>
+      <w:proofErr w:type="spellEnd"/>
+      <w:r>
+        <w:rPr>
+          <w:rFonts w:ascii="Times New Roman" w:eastAsia="Times New Roman" w:hAnsi="Times New Roman" w:cs="Times New Roman"/>
+          <w:sz w:val="24"/>
+          <w:szCs w:val="24"/>
+          <w:lang w:eastAsia="en-IN"/>
+        </w:rPr>
+        <w:t xml:space="preserve"> visual patterns in the plant images and classify the corresponding growth stage. The model generates probability scores representing the likelihood of different growth stages, allowing accurate identification of plant development phases. Model fine-tuning is performed using greenhouse crop image datasets to improve classification accuracy under varying environmental conditions.</w:t>
       </w:r>
     </w:p>
     <w:p>
@@ -9155,7 +9882,27 @@
           <w:szCs w:val="24"/>
           <w:lang w:eastAsia="en-IN"/>
         </w:rPr>
-        <w:t>The plant disease detection task aims to identify diseases affecting greenhouse crops using computer vision techniques. Early detection of plant diseases plays a critical role in preventing crop damage and maintaining healthy plant growth. In this task, plant images are analyzed using trained deep learning models capable of recognizing disease patterns present on leaves and plant surfaces. The system performs image-based disease classification and estimates the probability of disease occurrence. By identifying major greenhouse crop diseases at an early stage, the system supports timely intervention and effective disease management. The task also enables real-time disease alert generation to assist greenhouse operators in monitoring crop health conditions.</w:t>
+        <w:t xml:space="preserve">The plant disease detection task aims to identify diseases affecting greenhouse crops using computer vision techniques. Early detection of plant diseases plays a critical role in preventing crop damage and maintaining healthy plant growth. In this task, plant images are </w:t>
+      </w:r>
+      <w:proofErr w:type="spellStart"/>
+      <w:r>
+        <w:rPr>
+          <w:rFonts w:ascii="Times New Roman" w:eastAsia="Times New Roman" w:hAnsi="Times New Roman" w:cs="Times New Roman"/>
+          <w:sz w:val="24"/>
+          <w:szCs w:val="24"/>
+          <w:lang w:eastAsia="en-IN"/>
+        </w:rPr>
+        <w:t>analyzed</w:t>
+      </w:r>
+      <w:proofErr w:type="spellEnd"/>
+      <w:r>
+        <w:rPr>
+          <w:rFonts w:ascii="Times New Roman" w:eastAsia="Times New Roman" w:hAnsi="Times New Roman" w:cs="Times New Roman"/>
+          <w:sz w:val="24"/>
+          <w:szCs w:val="24"/>
+          <w:lang w:eastAsia="en-IN"/>
+        </w:rPr>
+        <w:t xml:space="preserve"> using trained deep learning models capable of recognizing disease patterns present on leaves and plant surfaces. The system performs image-based disease classification and estimates the probability of disease occurrence. By identifying major greenhouse crop diseases at an early stage, the system supports timely intervention and effective disease management. The task also enables real-time disease alert generation to assist greenhouse operators in monitoring crop health conditions.</w:t>
       </w:r>
     </w:p>
     <w:p>
@@ -9223,7 +9970,47 @@
           <w:szCs w:val="24"/>
           <w:lang w:eastAsia="en-IN"/>
         </w:rPr>
-        <w:t>This module performs predictive analysis to anticipate crop health risks, forecast plant growth progression, and analyze environmental trends affecting greenhouse cultivation. By utilizing temporal environmental data and predictive modeling techniques, the module enables the system to estimate future crop conditions and environmental states. These predictions assist greenhouse operators in making proactive decisions to maintain optimal plant growth conditions and reduce the risk of crop diseases.</w:t>
+        <w:t xml:space="preserve">This module performs predictive analysis to anticipate crop health risks, forecast plant growth progression, and </w:t>
+      </w:r>
+      <w:proofErr w:type="spellStart"/>
+      <w:r>
+        <w:rPr>
+          <w:rFonts w:ascii="Times New Roman" w:eastAsia="Times New Roman" w:hAnsi="Times New Roman" w:cs="Times New Roman"/>
+          <w:sz w:val="24"/>
+          <w:szCs w:val="24"/>
+          <w:lang w:eastAsia="en-IN"/>
+        </w:rPr>
+        <w:t>analyze</w:t>
+      </w:r>
+      <w:proofErr w:type="spellEnd"/>
+      <w:r>
+        <w:rPr>
+          <w:rFonts w:ascii="Times New Roman" w:eastAsia="Times New Roman" w:hAnsi="Times New Roman" w:cs="Times New Roman"/>
+          <w:sz w:val="24"/>
+          <w:szCs w:val="24"/>
+          <w:lang w:eastAsia="en-IN"/>
+        </w:rPr>
+        <w:t xml:space="preserve"> environmental trends affecting greenhouse cultivation. By utilizing temporal environmental data and predictive </w:t>
+      </w:r>
+      <w:proofErr w:type="spellStart"/>
+      <w:r>
+        <w:rPr>
+          <w:rFonts w:ascii="Times New Roman" w:eastAsia="Times New Roman" w:hAnsi="Times New Roman" w:cs="Times New Roman"/>
+          <w:sz w:val="24"/>
+          <w:szCs w:val="24"/>
+          <w:lang w:eastAsia="en-IN"/>
+        </w:rPr>
+        <w:t>modeling</w:t>
+      </w:r>
+      <w:proofErr w:type="spellEnd"/>
+      <w:r>
+        <w:rPr>
+          <w:rFonts w:ascii="Times New Roman" w:eastAsia="Times New Roman" w:hAnsi="Times New Roman" w:cs="Times New Roman"/>
+          <w:sz w:val="24"/>
+          <w:szCs w:val="24"/>
+          <w:lang w:eastAsia="en-IN"/>
+        </w:rPr>
+        <w:t xml:space="preserve"> techniques, the module enables the system to estimate future crop conditions and environmental states. These predictions assist greenhouse operators in making proactive decisions to maintain optimal plant growth conditions and reduce the risk of crop diseases.</w:t>
       </w:r>
     </w:p>
     <w:p>
@@ -9262,7 +10049,27 @@
           <w:szCs w:val="24"/>
           <w:lang w:eastAsia="en-IN"/>
         </w:rPr>
-        <w:t>.3 illustrates the task-level decomposition of the Predictive Analytics and Crop Health Forecasting Module. The module analyzes greenhouse environmental data and crop analysis outputs to predict disease risk, forecast growth progression, and estimate future environmental conditions.</w:t>
+        <w:t xml:space="preserve">.3 illustrates the task-level decomposition of the Predictive Analytics and Crop Health Forecasting Module. The module </w:t>
+      </w:r>
+      <w:proofErr w:type="spellStart"/>
+      <w:r>
+        <w:rPr>
+          <w:rFonts w:ascii="Times New Roman" w:eastAsia="Times New Roman" w:hAnsi="Times New Roman" w:cs="Times New Roman"/>
+          <w:sz w:val="24"/>
+          <w:szCs w:val="24"/>
+          <w:lang w:eastAsia="en-IN"/>
+        </w:rPr>
+        <w:t>analyzes</w:t>
+      </w:r>
+      <w:proofErr w:type="spellEnd"/>
+      <w:r>
+        <w:rPr>
+          <w:rFonts w:ascii="Times New Roman" w:eastAsia="Times New Roman" w:hAnsi="Times New Roman" w:cs="Times New Roman"/>
+          <w:sz w:val="24"/>
+          <w:szCs w:val="24"/>
+          <w:lang w:eastAsia="en-IN"/>
+        </w:rPr>
+        <w:t xml:space="preserve"> greenhouse environmental data and crop analysis outputs to predict disease risk, forecast growth progression, and estimate future environmental conditions.</w:t>
       </w:r>
     </w:p>
     <w:p>
@@ -9437,7 +10244,27 @@
           <w:szCs w:val="24"/>
           <w:lang w:eastAsia="en-IN"/>
         </w:rPr>
-        <w:t>The disease risk prediction task focuses on estimating the probability of disease occurrence based on greenhouse environmental conditions. Plant diseases are often influenced by environmental factors such as humidity, temperature, and moisture duration. This task analyzes environmental patterns and calculates a disease risk index that represents the likelihood of disease development under current greenhouse conditions. The system evaluates humidity duration, temperature–humidity interactions, and other environmental factors to determine disease risk levels. When the calculated risk exceeds predefined thresholds, the system generates early warning alerts to support preventive disease management strategies.</w:t>
+        <w:t xml:space="preserve">The disease risk prediction task focuses on estimating the probability of disease occurrence based on greenhouse environmental conditions. Plant diseases are often influenced by environmental factors such as humidity, temperature, and moisture duration. This task </w:t>
+      </w:r>
+      <w:proofErr w:type="spellStart"/>
+      <w:r>
+        <w:rPr>
+          <w:rFonts w:ascii="Times New Roman" w:eastAsia="Times New Roman" w:hAnsi="Times New Roman" w:cs="Times New Roman"/>
+          <w:sz w:val="24"/>
+          <w:szCs w:val="24"/>
+          <w:lang w:eastAsia="en-IN"/>
+        </w:rPr>
+        <w:t>analyzes</w:t>
+      </w:r>
+      <w:proofErr w:type="spellEnd"/>
+      <w:r>
+        <w:rPr>
+          <w:rFonts w:ascii="Times New Roman" w:eastAsia="Times New Roman" w:hAnsi="Times New Roman" w:cs="Times New Roman"/>
+          <w:sz w:val="24"/>
+          <w:szCs w:val="24"/>
+          <w:lang w:eastAsia="en-IN"/>
+        </w:rPr>
+        <w:t xml:space="preserve"> environmental patterns and calculates a disease risk index that represents the likelihood of disease development under current greenhouse conditions. The system evaluates humidity duration, temperature–humidity interactions, and other environmental factors to determine disease risk levels. When the calculated risk exceeds predefined thresholds, the system generates early warning alerts to support preventive disease management strategies.</w:t>
       </w:r>
     </w:p>
     <w:p>
@@ -9494,7 +10321,47 @@
           <w:szCs w:val="24"/>
           <w:lang w:eastAsia="en-IN"/>
         </w:rPr>
-        <w:t>The growth progression forecasting task aims to predict future plant growth stages using temporal environmental data. Plant growth is strongly influenced by environmental conditions over time, making time-series analysis important for understanding crop development patterns. This task utilizes sequence-based modeling techniques to analyze environmental trends and forecast plant growth progression. The model estimates the likely transition of plant growth stages within a defined time horizon and generates short-term predictions of plant development. By forecasting plant growth progression, the system supports improved crop monitoring and helps greenhouse operators anticipate upcoming cultivation requirements.</w:t>
+        <w:t xml:space="preserve">The growth progression forecasting task aims to predict future plant growth stages using temporal environmental data. Plant growth is strongly influenced by environmental conditions over time, making time-series analysis important for understanding crop development patterns. This task utilizes sequence-based </w:t>
+      </w:r>
+      <w:proofErr w:type="spellStart"/>
+      <w:r>
+        <w:rPr>
+          <w:rFonts w:ascii="Times New Roman" w:eastAsia="Times New Roman" w:hAnsi="Times New Roman" w:cs="Times New Roman"/>
+          <w:sz w:val="24"/>
+          <w:szCs w:val="24"/>
+          <w:lang w:eastAsia="en-IN"/>
+        </w:rPr>
+        <w:t>modeling</w:t>
+      </w:r>
+      <w:proofErr w:type="spellEnd"/>
+      <w:r>
+        <w:rPr>
+          <w:rFonts w:ascii="Times New Roman" w:eastAsia="Times New Roman" w:hAnsi="Times New Roman" w:cs="Times New Roman"/>
+          <w:sz w:val="24"/>
+          <w:szCs w:val="24"/>
+          <w:lang w:eastAsia="en-IN"/>
+        </w:rPr>
+        <w:t xml:space="preserve"> techniques to </w:t>
+      </w:r>
+      <w:proofErr w:type="spellStart"/>
+      <w:r>
+        <w:rPr>
+          <w:rFonts w:ascii="Times New Roman" w:eastAsia="Times New Roman" w:hAnsi="Times New Roman" w:cs="Times New Roman"/>
+          <w:sz w:val="24"/>
+          <w:szCs w:val="24"/>
+          <w:lang w:eastAsia="en-IN"/>
+        </w:rPr>
+        <w:t>analyze</w:t>
+      </w:r>
+      <w:proofErr w:type="spellEnd"/>
+      <w:r>
+        <w:rPr>
+          <w:rFonts w:ascii="Times New Roman" w:eastAsia="Times New Roman" w:hAnsi="Times New Roman" w:cs="Times New Roman"/>
+          <w:sz w:val="24"/>
+          <w:szCs w:val="24"/>
+          <w:lang w:eastAsia="en-IN"/>
+        </w:rPr>
+        <w:t xml:space="preserve"> environmental trends and forecast plant growth progression. The model estimates the likely transition of plant growth stages within a defined time horizon and generates short-term predictions of plant development. By forecasting plant growth progression, the system supports improved crop monitoring and helps greenhouse operators anticipate upcoming cultivation requirements.</w:t>
       </w:r>
     </w:p>
     <w:p>
@@ -9561,7 +10428,27 @@
           <w:lang w:eastAsia="en-IN"/>
         </w:rPr>
         <w:lastRenderedPageBreak/>
-        <w:t>temperature, humidity, and carbon dioxide concentration significantly affect plant development and disease susceptibility. This task analyzes historical environmental patterns to forecast upcoming environmental conditions within the greenhouse. The system also performs environmental trend analysis to identify potential anomalies or irregular sensor readings. These predictions provide valuable insights for maintaining stable greenhouse conditions and supporting proactive environmental management.</w:t>
+        <w:t xml:space="preserve">temperature, humidity, and carbon dioxide concentration significantly affect plant development and disease susceptibility. This task </w:t>
+      </w:r>
+      <w:proofErr w:type="spellStart"/>
+      <w:r>
+        <w:rPr>
+          <w:rFonts w:ascii="Times New Roman" w:eastAsia="Times New Roman" w:hAnsi="Times New Roman" w:cs="Times New Roman"/>
+          <w:sz w:val="24"/>
+          <w:szCs w:val="24"/>
+          <w:lang w:eastAsia="en-IN"/>
+        </w:rPr>
+        <w:t>analyzes</w:t>
+      </w:r>
+      <w:proofErr w:type="spellEnd"/>
+      <w:r>
+        <w:rPr>
+          <w:rFonts w:ascii="Times New Roman" w:eastAsia="Times New Roman" w:hAnsi="Times New Roman" w:cs="Times New Roman"/>
+          <w:sz w:val="24"/>
+          <w:szCs w:val="24"/>
+          <w:lang w:eastAsia="en-IN"/>
+        </w:rPr>
+        <w:t xml:space="preserve"> historical environmental patterns to forecast upcoming environmental conditions within the greenhouse. The system also performs environmental trend analysis to identify potential anomalies or irregular sensor readings. These predictions provide valuable insights for maintaining stable greenhouse conditions and supporting proactive environmental management.</w:t>
       </w:r>
     </w:p>
     <w:p>
@@ -10102,7 +10989,27 @@
           <w:szCs w:val="24"/>
           <w:lang w:eastAsia="en-IN"/>
         </w:rPr>
-        <w:t>This section describes the implementation of the Data Processing and AI-Based Crop Intelligence module in the AgriTwin-GH system. It explains how agricultural datasets and plant images are processed using data preprocessing techniques and deep learning models to identify crop growth stages and detect plant diseases.</w:t>
+        <w:t xml:space="preserve">This section describes the implementation of the Data Processing and AI-Based Crop Intelligence module in the </w:t>
+      </w:r>
+      <w:proofErr w:type="spellStart"/>
+      <w:r>
+        <w:rPr>
+          <w:rFonts w:ascii="Times New Roman" w:eastAsia="Times New Roman" w:hAnsi="Times New Roman" w:cs="Times New Roman"/>
+          <w:sz w:val="24"/>
+          <w:szCs w:val="24"/>
+          <w:lang w:eastAsia="en-IN"/>
+        </w:rPr>
+        <w:t>AgriTwin</w:t>
+      </w:r>
+      <w:proofErr w:type="spellEnd"/>
+      <w:r>
+        <w:rPr>
+          <w:rFonts w:ascii="Times New Roman" w:eastAsia="Times New Roman" w:hAnsi="Times New Roman" w:cs="Times New Roman"/>
+          <w:sz w:val="24"/>
+          <w:szCs w:val="24"/>
+          <w:lang w:eastAsia="en-IN"/>
+        </w:rPr>
+        <w:t>-GH system. It explains how agricultural datasets and plant images are processed using data preprocessing techniques and deep learning models to identify crop growth stages and detect plant diseases.</w:t>
       </w:r>
     </w:p>
     <w:p>
@@ -10170,7 +11077,27 @@
           <w:szCs w:val="24"/>
           <w:lang w:eastAsia="en-IN"/>
         </w:rPr>
-        <w:t xml:space="preserve">The Data Processing and AI-Based Crop Intelligence Module forms the foundation of the AgriTwin-GH system by transforming raw greenhouse data into actionable crop intelligence. It integrates environmental dataset preparation with image-based plant analysis to support accurate monitoring of crop conditions inside the greenhouse. Through unified data processing, crop growth stage classification, and plant disease detection, the module enables reliable interpretation of both environmental and visual crop information. By combining data </w:t>
+        <w:t xml:space="preserve">The Data Processing and AI-Based Crop Intelligence Module forms the foundation of the </w:t>
+      </w:r>
+      <w:proofErr w:type="spellStart"/>
+      <w:r>
+        <w:rPr>
+          <w:rFonts w:ascii="Times New Roman" w:eastAsia="Times New Roman" w:hAnsi="Times New Roman" w:cs="Times New Roman"/>
+          <w:sz w:val="24"/>
+          <w:szCs w:val="24"/>
+          <w:lang w:eastAsia="en-IN"/>
+        </w:rPr>
+        <w:t>AgriTwin</w:t>
+      </w:r>
+      <w:proofErr w:type="spellEnd"/>
+      <w:r>
+        <w:rPr>
+          <w:rFonts w:ascii="Times New Roman" w:eastAsia="Times New Roman" w:hAnsi="Times New Roman" w:cs="Times New Roman"/>
+          <w:sz w:val="24"/>
+          <w:szCs w:val="24"/>
+          <w:lang w:eastAsia="en-IN"/>
+        </w:rPr>
+        <w:t xml:space="preserve">-GH system by transforming raw greenhouse data into actionable crop intelligence. It integrates environmental dataset preparation with image-based plant analysis to support accurate monitoring of crop conditions inside the greenhouse. Through unified data processing, crop growth stage classification, and plant disease detection, the module enables reliable interpretation of both environmental and visual crop information. By combining data </w:t>
       </w:r>
       <w:r>
         <w:rPr>
@@ -10277,7 +11204,27 @@
           <w:szCs w:val="24"/>
           <w:lang w:eastAsia="en-IN"/>
         </w:rPr>
-        <w:t>used to transform heterogeneous environmental data into a standardized greenhouse dataset suitable for downstream AI analysis. Initially, raw environmental information is collected from external weather API data sources, which may contain incomplete records, inconsistent timestamps, and noise typical of real-world agricultural datasets. This data is first passed to the Data Ingestion component, where the system collects and integrates incoming environmental measurements into the internal processing framework. The next stage performs Data Validation and Cleaning, where corrupted entries, inconsistent values, and anomalous measurements are identified and corrected or removed. Following this, the Missing Value Handling stage ensures that incomplete records are properly treated using appropriate imputation strategies so that the dataset remains consistent and usable for machine learning applications. The processed data then undergoes Temporal Synchronization, where all environmental parameters such as temperature, humidity, carbon dioxide concentration, and light intensity are aligned along a consistent time axis to maintain accurate temporal relationships between variables. Finally, the Feature Engineering stage derives meaningful environmental indicators and structured variables that better represent greenhouse conditions. The result of this pipeline is a Standardized Greenhouse Dataset, which serves as a reliable and structured input for subsequent AI-based crop intelligence models within the AgriTwin-GH platform.</w:t>
+        <w:t xml:space="preserve">used to transform heterogeneous environmental data into a standardized greenhouse dataset suitable for downstream AI analysis. Initially, raw environmental information is collected from external weather API data sources, which may contain incomplete records, inconsistent timestamps, and noise typical of real-world agricultural datasets. This data is first passed to the Data Ingestion component, where the system collects and integrates incoming environmental measurements into the internal processing framework. The next stage performs Data Validation and Cleaning, where corrupted entries, inconsistent values, and anomalous measurements are identified and corrected or removed. Following this, the Missing Value Handling stage ensures that incomplete records are properly treated using appropriate imputation strategies so that the dataset remains consistent and usable for machine learning applications. The processed data then undergoes Temporal Synchronization, where all environmental parameters such as temperature, humidity, carbon dioxide concentration, and light intensity are aligned along a consistent time axis to maintain accurate temporal relationships between variables. Finally, the Feature Engineering stage derives meaningful environmental indicators and structured variables that better represent greenhouse conditions. The result of this pipeline is a Standardized Greenhouse Dataset, which serves as a reliable and structured input for subsequent AI-based crop intelligence models within the </w:t>
+      </w:r>
+      <w:proofErr w:type="spellStart"/>
+      <w:r>
+        <w:rPr>
+          <w:rFonts w:ascii="Times New Roman" w:eastAsia="Times New Roman" w:hAnsi="Times New Roman" w:cs="Times New Roman"/>
+          <w:sz w:val="24"/>
+          <w:szCs w:val="24"/>
+          <w:lang w:eastAsia="en-IN"/>
+        </w:rPr>
+        <w:t>AgriTwin</w:t>
+      </w:r>
+      <w:proofErr w:type="spellEnd"/>
+      <w:r>
+        <w:rPr>
+          <w:rFonts w:ascii="Times New Roman" w:eastAsia="Times New Roman" w:hAnsi="Times New Roman" w:cs="Times New Roman"/>
+          <w:sz w:val="24"/>
+          <w:szCs w:val="24"/>
+          <w:lang w:eastAsia="en-IN"/>
+        </w:rPr>
+        <w:t>-GH platform.</w:t>
       </w:r>
     </w:p>
     <w:p>
@@ -10525,28 +11472,108 @@
           <w:szCs w:val="24"/>
           <w:lang w:eastAsia="en-IN"/>
         </w:rPr>
-        <w:t>how plant image data is processed through a series of computer vision and deep learning operations to perform crop growth stage classification and plant disease detection in the AgriTwin-GH system. Initially, plant image data collected from greenhouse crops is passed through image preprocessing and augmentation stages to improve input consistency and increase dataset diversity. The processed images are then analyzed using a convolutional neural network–based feature extraction process, where important visual patterns related to plant structure and leaf conditions are extracted. These features are subsequently processed by the EfficientNet deep learning model, which serves as the primary classification architecture. The model simultaneously performs two analytical tasks: identifying the crop growth stage of tomato plants and detecting potential plant diseases affecting greenhouse crops. The outputs generated from these tasks are then combined to produce meaningful crop intelligence results such as growth stage labels and plant disease labels that support greenhouse crop monitoring and management.</w:t>
-      </w:r>
-    </w:p>
-    <w:p>
-      <w:pPr>
-        <w:spacing w:beforeAutospacing="1" w:afterAutospacing="1" w:line="240" w:lineRule="auto"/>
-        <w:jc w:val="both"/>
-        <w:rPr>
-          <w:rFonts w:ascii="Times New Roman" w:eastAsia="Times New Roman" w:hAnsi="Times New Roman" w:cs="Times New Roman"/>
-          <w:sz w:val="24"/>
-          <w:szCs w:val="24"/>
-          <w:lang w:eastAsia="en-IN"/>
-        </w:rPr>
-      </w:pPr>
-      <w:r>
-        <w:rPr>
-          <w:rFonts w:ascii="Times New Roman" w:eastAsia="Times New Roman" w:hAnsi="Times New Roman" w:cs="Times New Roman"/>
-          <w:sz w:val="24"/>
-          <w:szCs w:val="24"/>
-          <w:lang w:eastAsia="en-IN"/>
-        </w:rPr>
-        <w:t>Fig. 6.2 illustrates the Growth Stage Classification and Disease Detection workflow, showing how plant image data is processed through preprocessing, augmentation, CNN-based feature extraction, and the EfficientNet model to generate crop growth stage predictions and plant disease detection results.</w:t>
+        <w:t xml:space="preserve">how plant image data is processed through a series of computer vision and deep learning operations to perform crop growth stage classification and plant disease detection in the </w:t>
+      </w:r>
+      <w:proofErr w:type="spellStart"/>
+      <w:r>
+        <w:rPr>
+          <w:rFonts w:ascii="Times New Roman" w:eastAsia="Times New Roman" w:hAnsi="Times New Roman" w:cs="Times New Roman"/>
+          <w:sz w:val="24"/>
+          <w:szCs w:val="24"/>
+          <w:lang w:eastAsia="en-IN"/>
+        </w:rPr>
+        <w:t>AgriTwin</w:t>
+      </w:r>
+      <w:proofErr w:type="spellEnd"/>
+      <w:r>
+        <w:rPr>
+          <w:rFonts w:ascii="Times New Roman" w:eastAsia="Times New Roman" w:hAnsi="Times New Roman" w:cs="Times New Roman"/>
+          <w:sz w:val="24"/>
+          <w:szCs w:val="24"/>
+          <w:lang w:eastAsia="en-IN"/>
+        </w:rPr>
+        <w:t xml:space="preserve">-GH system. Initially, plant image data collected from greenhouse crops is passed through image preprocessing and augmentation stages to improve input consistency and increase dataset diversity. The processed images are then </w:t>
+      </w:r>
+      <w:proofErr w:type="spellStart"/>
+      <w:r>
+        <w:rPr>
+          <w:rFonts w:ascii="Times New Roman" w:eastAsia="Times New Roman" w:hAnsi="Times New Roman" w:cs="Times New Roman"/>
+          <w:sz w:val="24"/>
+          <w:szCs w:val="24"/>
+          <w:lang w:eastAsia="en-IN"/>
+        </w:rPr>
+        <w:t>analyzed</w:t>
+      </w:r>
+      <w:proofErr w:type="spellEnd"/>
+      <w:r>
+        <w:rPr>
+          <w:rFonts w:ascii="Times New Roman" w:eastAsia="Times New Roman" w:hAnsi="Times New Roman" w:cs="Times New Roman"/>
+          <w:sz w:val="24"/>
+          <w:szCs w:val="24"/>
+          <w:lang w:eastAsia="en-IN"/>
+        </w:rPr>
+        <w:t xml:space="preserve"> using a convolutional neural network–based feature extraction process, where important visual patterns related to plant structure and leaf conditions are extracted. These features are subsequently processed by the </w:t>
+      </w:r>
+      <w:proofErr w:type="spellStart"/>
+      <w:r>
+        <w:rPr>
+          <w:rFonts w:ascii="Times New Roman" w:eastAsia="Times New Roman" w:hAnsi="Times New Roman" w:cs="Times New Roman"/>
+          <w:sz w:val="24"/>
+          <w:szCs w:val="24"/>
+          <w:lang w:eastAsia="en-IN"/>
+        </w:rPr>
+        <w:t>EfficientNet</w:t>
+      </w:r>
+      <w:proofErr w:type="spellEnd"/>
+      <w:r>
+        <w:rPr>
+          <w:rFonts w:ascii="Times New Roman" w:eastAsia="Times New Roman" w:hAnsi="Times New Roman" w:cs="Times New Roman"/>
+          <w:sz w:val="24"/>
+          <w:szCs w:val="24"/>
+          <w:lang w:eastAsia="en-IN"/>
+        </w:rPr>
+        <w:t xml:space="preserve"> deep learning model, which serves as the primary classification architecture. The model simultaneously performs two analytical tasks: identifying the crop growth stage of tomato plants and detecting potential plant diseases affecting greenhouse crops. The outputs generated from these tasks are then combined to produce meaningful crop intelligence results such as growth stage labels and plant disease labels that support greenhouse crop monitoring and management.</w:t>
+      </w:r>
+    </w:p>
+    <w:p>
+      <w:pPr>
+        <w:spacing w:beforeAutospacing="1" w:afterAutospacing="1" w:line="240" w:lineRule="auto"/>
+        <w:jc w:val="both"/>
+        <w:rPr>
+          <w:rFonts w:ascii="Times New Roman" w:eastAsia="Times New Roman" w:hAnsi="Times New Roman" w:cs="Times New Roman"/>
+          <w:sz w:val="24"/>
+          <w:szCs w:val="24"/>
+          <w:lang w:eastAsia="en-IN"/>
+        </w:rPr>
+      </w:pPr>
+      <w:r>
+        <w:rPr>
+          <w:rFonts w:ascii="Times New Roman" w:eastAsia="Times New Roman" w:hAnsi="Times New Roman" w:cs="Times New Roman"/>
+          <w:sz w:val="24"/>
+          <w:szCs w:val="24"/>
+          <w:lang w:eastAsia="en-IN"/>
+        </w:rPr>
+        <w:t xml:space="preserve">Fig. 6.2 illustrates the Growth Stage Classification and Disease Detection workflow, showing how plant image data is processed through preprocessing, augmentation, CNN-based feature extraction, and the </w:t>
+      </w:r>
+      <w:proofErr w:type="spellStart"/>
+      <w:r>
+        <w:rPr>
+          <w:rFonts w:ascii="Times New Roman" w:eastAsia="Times New Roman" w:hAnsi="Times New Roman" w:cs="Times New Roman"/>
+          <w:sz w:val="24"/>
+          <w:szCs w:val="24"/>
+          <w:lang w:eastAsia="en-IN"/>
+        </w:rPr>
+        <w:t>EfficientNet</w:t>
+      </w:r>
+      <w:proofErr w:type="spellEnd"/>
+      <w:r>
+        <w:rPr>
+          <w:rFonts w:ascii="Times New Roman" w:eastAsia="Times New Roman" w:hAnsi="Times New Roman" w:cs="Times New Roman"/>
+          <w:sz w:val="24"/>
+          <w:szCs w:val="24"/>
+          <w:lang w:eastAsia="en-IN"/>
+        </w:rPr>
+        <w:t xml:space="preserve"> model to generate crop growth stage predictions and plant disease detection results.</w:t>
       </w:r>
     </w:p>
     <w:p>
@@ -10765,7 +11792,27 @@
           <w:szCs w:val="24"/>
           <w:lang w:eastAsia="en-IN"/>
         </w:rPr>
-        <w:t>The component-level design of Module 1 defines the internal architectural structure that enables the AgriTwin-GH system to transform heterogeneous greenhouse data and plant image inputs into actionable crop intelligence. The module is organized into functional layers: Inputs, Core Processing, AI Analysis, Output Management</w:t>
+        <w:t xml:space="preserve">The component-level design of Module 1 defines the internal architectural structure that enables the </w:t>
+      </w:r>
+      <w:proofErr w:type="spellStart"/>
+      <w:r>
+        <w:rPr>
+          <w:rFonts w:ascii="Times New Roman" w:eastAsia="Times New Roman" w:hAnsi="Times New Roman" w:cs="Times New Roman"/>
+          <w:sz w:val="24"/>
+          <w:szCs w:val="24"/>
+          <w:lang w:eastAsia="en-IN"/>
+        </w:rPr>
+        <w:t>AgriTwin</w:t>
+      </w:r>
+      <w:proofErr w:type="spellEnd"/>
+      <w:r>
+        <w:rPr>
+          <w:rFonts w:ascii="Times New Roman" w:eastAsia="Times New Roman" w:hAnsi="Times New Roman" w:cs="Times New Roman"/>
+          <w:sz w:val="24"/>
+          <w:szCs w:val="24"/>
+          <w:lang w:eastAsia="en-IN"/>
+        </w:rPr>
+        <w:t>-GH system to transform heterogeneous greenhouse data and plant image inputs into actionable crop intelligence. The module is organized into functional layers: Inputs, Core Processing, AI Analysis, Output Management</w:t>
       </w:r>
       <w:r>
         <w:rPr>
@@ -10793,7 +11840,27 @@
           <w:lang w:eastAsia="en-IN"/>
         </w:rPr>
         <w:lastRenderedPageBreak/>
-        <w:t>scores and prediction results are organized by the Result Manager to generate structured outputs such as standardized greenhouse datasets, crop growth stage predictions, and disease detection results. This component-oriented design ensures modular processing, clear separation of responsibilities between system layers, and efficient integration of environmental data processing with computer vision-based crop intelligence within the AgriTwin-GH platform.</w:t>
+        <w:t xml:space="preserve">scores and prediction results are organized by the Result Manager to generate structured outputs such as standardized greenhouse datasets, crop growth stage predictions, and disease detection results. This component-oriented design ensures modular processing, clear separation of responsibilities between system layers, and efficient integration of environmental data processing with computer vision-based crop intelligence within the </w:t>
+      </w:r>
+      <w:proofErr w:type="spellStart"/>
+      <w:r>
+        <w:rPr>
+          <w:rFonts w:ascii="Times New Roman" w:eastAsia="Times New Roman" w:hAnsi="Times New Roman" w:cs="Times New Roman"/>
+          <w:sz w:val="24"/>
+          <w:szCs w:val="24"/>
+          <w:lang w:eastAsia="en-IN"/>
+        </w:rPr>
+        <w:t>AgriTwin</w:t>
+      </w:r>
+      <w:proofErr w:type="spellEnd"/>
+      <w:r>
+        <w:rPr>
+          <w:rFonts w:ascii="Times New Roman" w:eastAsia="Times New Roman" w:hAnsi="Times New Roman" w:cs="Times New Roman"/>
+          <w:sz w:val="24"/>
+          <w:szCs w:val="24"/>
+          <w:lang w:eastAsia="en-IN"/>
+        </w:rPr>
+        <w:t>-GH platform.</w:t>
       </w:r>
     </w:p>
     <w:p>
@@ -11067,49 +12134,129 @@
           <w:szCs w:val="24"/>
           <w:lang w:eastAsia="en-IN"/>
         </w:rPr>
-        <w:t>The data processing demonstration illustrates how raw outdoor weather data is transformed into a structured indoor greenhouse dataset used by the AgriTwin-GH system. The input data contains environmental variables such as temperature, humidity, wind speed, solar radiation, and timestamps, which are collected from weather datasets for the Dindigul region. These measurements are first standardized and expanded into hourly records to simulate continuous greenhouse monitoring conditions.</w:t>
-      </w:r>
-    </w:p>
-    <w:p>
-      <w:pPr>
-        <w:spacing w:beforeAutospacing="1" w:afterAutospacing="1" w:line="240" w:lineRule="auto"/>
-        <w:jc w:val="both"/>
-        <w:rPr>
-          <w:rFonts w:ascii="Times New Roman" w:eastAsia="Times New Roman" w:hAnsi="Times New Roman" w:cs="Times New Roman"/>
-          <w:sz w:val="24"/>
-          <w:szCs w:val="24"/>
-          <w:lang w:eastAsia="en-IN"/>
-        </w:rPr>
-      </w:pPr>
-      <w:r>
-        <w:rPr>
-          <w:rFonts w:ascii="Times New Roman" w:eastAsia="Times New Roman" w:hAnsi="Times New Roman" w:cs="Times New Roman"/>
-          <w:sz w:val="24"/>
-          <w:szCs w:val="24"/>
-          <w:lang w:eastAsia="en-IN"/>
-        </w:rPr>
-        <w:t xml:space="preserve">Using these environmental inputs, several greenhouse features are derived to represent realistic indoor cultivation conditions. Outdoor temperature and solar radiation are used to estimate indoor temperature, while outdoor humidity and temperature variation are used to compute indoor humidity levels. Similarly, outdoor wind speed is converted into indoor air velocity, representing the reduced airflow inside the greenhouse structure. Based on the calculated indoor environmental variables, additional agronomic indicators are extracted. Indoor temperature and humidity are used to compute dew point temperature, and together they are also used to calculate the Vapor Pressure Deficit (VPD), which indicates plant transpiration stress levels. Furthermore, high indoor humidity sustained for multiple hours is used to derive a leaf wetness proxy indicator, which helps identify potential disease-favorable conditions inside the greenhouse. </w:t>
-      </w:r>
-    </w:p>
-    <w:p>
-      <w:pPr>
-        <w:spacing w:beforeAutospacing="1" w:afterAutospacing="1" w:line="240" w:lineRule="auto"/>
-        <w:jc w:val="both"/>
-        <w:rPr>
-          <w:rFonts w:ascii="Times New Roman" w:eastAsia="Times New Roman" w:hAnsi="Times New Roman" w:cs="Times New Roman"/>
-          <w:sz w:val="24"/>
-          <w:szCs w:val="24"/>
-          <w:lang w:eastAsia="en-IN"/>
-        </w:rPr>
-      </w:pPr>
-      <w:r>
-        <w:rPr>
-          <w:rFonts w:ascii="Times New Roman" w:eastAsia="Times New Roman" w:hAnsi="Times New Roman" w:cs="Times New Roman"/>
-          <w:sz w:val="24"/>
-          <w:szCs w:val="24"/>
-          <w:lang w:eastAsia="en-IN"/>
-        </w:rPr>
-        <w:t>The final processed dataset contains key greenhouse parameters including indoor temperature, indoor humidity, indoor air velocity, CO₂ concentration, solar radiation, vapor pressure deficit (VPD), dew point temperature, and leaf wetness indicators. This standardized dataset serves as the primary environmental input for subsequent AI-based modules in the AgriTwin-GH system.</w:t>
+        <w:t xml:space="preserve">The data processing demonstration illustrates how raw outdoor weather data is transformed into a structured indoor greenhouse dataset used by the </w:t>
+      </w:r>
+      <w:proofErr w:type="spellStart"/>
+      <w:r>
+        <w:rPr>
+          <w:rFonts w:ascii="Times New Roman" w:eastAsia="Times New Roman" w:hAnsi="Times New Roman" w:cs="Times New Roman"/>
+          <w:sz w:val="24"/>
+          <w:szCs w:val="24"/>
+          <w:lang w:eastAsia="en-IN"/>
+        </w:rPr>
+        <w:t>AgriTwin</w:t>
+      </w:r>
+      <w:proofErr w:type="spellEnd"/>
+      <w:r>
+        <w:rPr>
+          <w:rFonts w:ascii="Times New Roman" w:eastAsia="Times New Roman" w:hAnsi="Times New Roman" w:cs="Times New Roman"/>
+          <w:sz w:val="24"/>
+          <w:szCs w:val="24"/>
+          <w:lang w:eastAsia="en-IN"/>
+        </w:rPr>
+        <w:t xml:space="preserve">-GH system. The input data contains environmental variables such as temperature, humidity, wind speed, solar radiation, and timestamps, which are collected from weather datasets for the </w:t>
+      </w:r>
+      <w:proofErr w:type="spellStart"/>
+      <w:r>
+        <w:rPr>
+          <w:rFonts w:ascii="Times New Roman" w:eastAsia="Times New Roman" w:hAnsi="Times New Roman" w:cs="Times New Roman"/>
+          <w:sz w:val="24"/>
+          <w:szCs w:val="24"/>
+          <w:lang w:eastAsia="en-IN"/>
+        </w:rPr>
+        <w:t>Dindigul</w:t>
+      </w:r>
+      <w:proofErr w:type="spellEnd"/>
+      <w:r>
+        <w:rPr>
+          <w:rFonts w:ascii="Times New Roman" w:eastAsia="Times New Roman" w:hAnsi="Times New Roman" w:cs="Times New Roman"/>
+          <w:sz w:val="24"/>
+          <w:szCs w:val="24"/>
+          <w:lang w:eastAsia="en-IN"/>
+        </w:rPr>
+        <w:t xml:space="preserve"> region. These measurements are first standardized and expanded into hourly records to simulate continuous greenhouse monitoring conditions.</w:t>
+      </w:r>
+    </w:p>
+    <w:p>
+      <w:pPr>
+        <w:spacing w:beforeAutospacing="1" w:afterAutospacing="1" w:line="240" w:lineRule="auto"/>
+        <w:jc w:val="both"/>
+        <w:rPr>
+          <w:rFonts w:ascii="Times New Roman" w:eastAsia="Times New Roman" w:hAnsi="Times New Roman" w:cs="Times New Roman"/>
+          <w:sz w:val="24"/>
+          <w:szCs w:val="24"/>
+          <w:lang w:eastAsia="en-IN"/>
+        </w:rPr>
+      </w:pPr>
+      <w:r>
+        <w:rPr>
+          <w:rFonts w:ascii="Times New Roman" w:eastAsia="Times New Roman" w:hAnsi="Times New Roman" w:cs="Times New Roman"/>
+          <w:sz w:val="24"/>
+          <w:szCs w:val="24"/>
+          <w:lang w:eastAsia="en-IN"/>
+        </w:rPr>
+        <w:t>Using these environmental inputs, several greenhouse features are derived to represent realistic indoor cultivation conditions. Outdoor temperature and solar radiation are used to estimate indoor temperature, while outdoor humidity and temperature variation are used to compute indoor humidity levels. Similarly, outdoor wind speed is converted into indoor air velocity, representing the reduced airflow inside the greenhouse structure. Based on the calculated indoor environmental variables, additional agronomic indicators are extracted. Indoor temperature and humidity are used to compute dew point temperature, and together they are also used to calculate the Vapor Pressure Deficit (VPD), which indicates plant transpiration stress levels. Furthermore, high indoor humidity sustained for multiple hours is used to derive a leaf wetness proxy indicator, which helps identify potential disease-</w:t>
+      </w:r>
+      <w:proofErr w:type="spellStart"/>
+      <w:r>
+        <w:rPr>
+          <w:rFonts w:ascii="Times New Roman" w:eastAsia="Times New Roman" w:hAnsi="Times New Roman" w:cs="Times New Roman"/>
+          <w:sz w:val="24"/>
+          <w:szCs w:val="24"/>
+          <w:lang w:eastAsia="en-IN"/>
+        </w:rPr>
+        <w:t>favorable</w:t>
+      </w:r>
+      <w:proofErr w:type="spellEnd"/>
+      <w:r>
+        <w:rPr>
+          <w:rFonts w:ascii="Times New Roman" w:eastAsia="Times New Roman" w:hAnsi="Times New Roman" w:cs="Times New Roman"/>
+          <w:sz w:val="24"/>
+          <w:szCs w:val="24"/>
+          <w:lang w:eastAsia="en-IN"/>
+        </w:rPr>
+        <w:t xml:space="preserve"> conditions inside the greenhouse. </w:t>
+      </w:r>
+    </w:p>
+    <w:p>
+      <w:pPr>
+        <w:spacing w:beforeAutospacing="1" w:afterAutospacing="1" w:line="240" w:lineRule="auto"/>
+        <w:jc w:val="both"/>
+        <w:rPr>
+          <w:rFonts w:ascii="Times New Roman" w:eastAsia="Times New Roman" w:hAnsi="Times New Roman" w:cs="Times New Roman"/>
+          <w:sz w:val="24"/>
+          <w:szCs w:val="24"/>
+          <w:lang w:eastAsia="en-IN"/>
+        </w:rPr>
+      </w:pPr>
+      <w:r>
+        <w:rPr>
+          <w:rFonts w:ascii="Times New Roman" w:eastAsia="Times New Roman" w:hAnsi="Times New Roman" w:cs="Times New Roman"/>
+          <w:sz w:val="24"/>
+          <w:szCs w:val="24"/>
+          <w:lang w:eastAsia="en-IN"/>
+        </w:rPr>
+        <w:t xml:space="preserve">The final processed dataset contains key greenhouse parameters including indoor temperature, indoor humidity, indoor air velocity, CO₂ concentration, solar radiation, vapor pressure deficit (VPD), dew point temperature, and leaf wetness indicators. This standardized dataset serves as the primary environmental input for subsequent AI-based modules in the </w:t>
+      </w:r>
+      <w:proofErr w:type="spellStart"/>
+      <w:r>
+        <w:rPr>
+          <w:rFonts w:ascii="Times New Roman" w:eastAsia="Times New Roman" w:hAnsi="Times New Roman" w:cs="Times New Roman"/>
+          <w:sz w:val="24"/>
+          <w:szCs w:val="24"/>
+          <w:lang w:eastAsia="en-IN"/>
+        </w:rPr>
+        <w:t>AgriTwin</w:t>
+      </w:r>
+      <w:proofErr w:type="spellEnd"/>
+      <w:r>
+        <w:rPr>
+          <w:rFonts w:ascii="Times New Roman" w:eastAsia="Times New Roman" w:hAnsi="Times New Roman" w:cs="Times New Roman"/>
+          <w:sz w:val="24"/>
+          <w:szCs w:val="24"/>
+          <w:lang w:eastAsia="en-IN"/>
+        </w:rPr>
+        <w:t>-GH system.</w:t>
       </w:r>
     </w:p>
     <w:p>
@@ -11166,7 +12313,27 @@
           <w:szCs w:val="24"/>
           <w:lang w:eastAsia="en-IN"/>
         </w:rPr>
-        <w:t>illustrates a sample of the raw environmental dataset retrieved from the weather API, showing the outdoor climatic parameters that serve as the initial input for the AgriTwin-GH data processing pipeline.</w:t>
+        <w:t xml:space="preserve">illustrates a sample of the raw environmental dataset retrieved from the weather API, showing the outdoor climatic parameters that serve as the initial input for the </w:t>
+      </w:r>
+      <w:proofErr w:type="spellStart"/>
+      <w:r>
+        <w:rPr>
+          <w:rFonts w:ascii="Times New Roman" w:eastAsia="Times New Roman" w:hAnsi="Times New Roman" w:cs="Times New Roman"/>
+          <w:sz w:val="24"/>
+          <w:szCs w:val="24"/>
+          <w:lang w:eastAsia="en-IN"/>
+        </w:rPr>
+        <w:t>AgriTwin</w:t>
+      </w:r>
+      <w:proofErr w:type="spellEnd"/>
+      <w:r>
+        <w:rPr>
+          <w:rFonts w:ascii="Times New Roman" w:eastAsia="Times New Roman" w:hAnsi="Times New Roman" w:cs="Times New Roman"/>
+          <w:sz w:val="24"/>
+          <w:szCs w:val="24"/>
+          <w:lang w:eastAsia="en-IN"/>
+        </w:rPr>
+        <w:t>-GH data processing pipeline.</w:t>
       </w:r>
     </w:p>
     <w:p>
@@ -11286,7 +12453,27 @@
           <w:szCs w:val="20"/>
           <w:lang w:eastAsia="en-IN"/>
         </w:rPr>
-        <w:t>Extract of the Dindigul Weather Dataset</w:t>
+        <w:t xml:space="preserve">Extract of the </w:t>
+      </w:r>
+      <w:proofErr w:type="spellStart"/>
+      <w:r>
+        <w:rPr>
+          <w:rFonts w:ascii="Times New Roman" w:eastAsia="Times New Roman" w:hAnsi="Times New Roman" w:cs="Times New Roman"/>
+          <w:sz w:val="20"/>
+          <w:szCs w:val="20"/>
+          <w:lang w:eastAsia="en-IN"/>
+        </w:rPr>
+        <w:t>Dindigul</w:t>
+      </w:r>
+      <w:proofErr w:type="spellEnd"/>
+      <w:r>
+        <w:rPr>
+          <w:rFonts w:ascii="Times New Roman" w:eastAsia="Times New Roman" w:hAnsi="Times New Roman" w:cs="Times New Roman"/>
+          <w:sz w:val="20"/>
+          <w:szCs w:val="20"/>
+          <w:lang w:eastAsia="en-IN"/>
+        </w:rPr>
+        <w:t xml:space="preserve"> Weather Dataset</w:t>
       </w:r>
     </w:p>
     <w:p>
@@ -11781,6 +12968,7 @@
           <w:lang w:eastAsia="en-IN"/>
         </w:rPr>
       </w:pPr>
+      <w:proofErr w:type="spellStart"/>
       <w:r>
         <w:rPr>
           <w:rFonts w:ascii="Cambria Math" w:eastAsia="Times New Roman" w:hAnsi="Cambria Math" w:cs="Times New Roman"/>
@@ -11791,6 +12979,7 @@
         </w:rPr>
         <w:t>IndoorAirVelocity</w:t>
       </w:r>
+      <w:proofErr w:type="spellEnd"/>
       <w:r>
         <w:rPr>
           <w:rFonts w:ascii="Cambria Math" w:eastAsia="Times New Roman" w:hAnsi="Cambria Math" w:cs="Times New Roman"/>
@@ -12752,7 +13941,27 @@
           <w:szCs w:val="24"/>
           <w:lang w:eastAsia="en-IN"/>
         </w:rPr>
-        <w:t>During prediction, the model analyzes a leaf image and produces outputs including the predicted disease label, confidence score, and top predicted classes, which help identify plant health conditions within the greenhouse monitoring system.</w:t>
+        <w:t xml:space="preserve">During prediction, the model </w:t>
+      </w:r>
+      <w:proofErr w:type="spellStart"/>
+      <w:r>
+        <w:rPr>
+          <w:rFonts w:ascii="Times New Roman" w:eastAsia="Times New Roman" w:hAnsi="Times New Roman" w:cs="Times New Roman"/>
+          <w:sz w:val="24"/>
+          <w:szCs w:val="24"/>
+          <w:lang w:eastAsia="en-IN"/>
+        </w:rPr>
+        <w:t>analyzes</w:t>
+      </w:r>
+      <w:proofErr w:type="spellEnd"/>
+      <w:r>
+        <w:rPr>
+          <w:rFonts w:ascii="Times New Roman" w:eastAsia="Times New Roman" w:hAnsi="Times New Roman" w:cs="Times New Roman"/>
+          <w:sz w:val="24"/>
+          <w:szCs w:val="24"/>
+          <w:lang w:eastAsia="en-IN"/>
+        </w:rPr>
+        <w:t xml:space="preserve"> a leaf image and produces outputs including the predicted disease label, confidence score, and top predicted classes, which help identify plant health conditions within the greenhouse monitoring system.</w:t>
       </w:r>
     </w:p>
     <w:p>
@@ -13113,7 +14322,27 @@
           <w:szCs w:val="24"/>
           <w:lang w:eastAsia="en-IN"/>
         </w:rPr>
-        <w:t xml:space="preserve"> illustrates the Phase-2 fine-tuning stage, where selected backbone layers of the EfficientNetB0 model are unfrozen and trained to improve feature representation. The figure shows the improvement in validation accuracy during fine-tuning, resulting in the final optimized model used for tomato disease detection in the AgriTwin-GH system.</w:t>
+        <w:t xml:space="preserve"> illustrates the Phase-2 fine-tuning stage, where selected backbone layers of the EfficientNetB0 model are unfrozen and trained to improve feature representation. The figure shows the improvement in validation accuracy during fine-tuning, resulting in the final optimized model used for tomato disease detection in the </w:t>
+      </w:r>
+      <w:proofErr w:type="spellStart"/>
+      <w:r>
+        <w:rPr>
+          <w:rFonts w:ascii="Times New Roman" w:eastAsia="Times New Roman" w:hAnsi="Times New Roman" w:cs="Times New Roman"/>
+          <w:sz w:val="24"/>
+          <w:szCs w:val="24"/>
+          <w:lang w:eastAsia="en-IN"/>
+        </w:rPr>
+        <w:t>AgriTwin</w:t>
+      </w:r>
+      <w:proofErr w:type="spellEnd"/>
+      <w:r>
+        <w:rPr>
+          <w:rFonts w:ascii="Times New Roman" w:eastAsia="Times New Roman" w:hAnsi="Times New Roman" w:cs="Times New Roman"/>
+          <w:sz w:val="24"/>
+          <w:szCs w:val="24"/>
+          <w:lang w:eastAsia="en-IN"/>
+        </w:rPr>
+        <w:t>-GH system.</w:t>
       </w:r>
     </w:p>
     <w:p>
@@ -13330,7 +14559,47 @@
           <w:szCs w:val="24"/>
           <w:lang w:eastAsia="en-IN"/>
         </w:rPr>
-        <w:t>To improve the model’s generalization ability, controlled data augmentation techniques are applied to the training images. These include horizontal flipping, small rotations, zoom operations, brightness adjustments, and mild color variations. The augmentation intensity is kept moderate to preserve important plant color and structural features that are essential for distinguishing different tomato growth stages.</w:t>
+        <w:t xml:space="preserve">To improve the model’s generalization ability, controlled data augmentation techniques are applied to the training images. These include horizontal flipping, small rotations, zoom operations, brightness adjustments, and mild </w:t>
+      </w:r>
+      <w:proofErr w:type="spellStart"/>
+      <w:r>
+        <w:rPr>
+          <w:rFonts w:ascii="Times New Roman" w:eastAsia="Times New Roman" w:hAnsi="Times New Roman" w:cs="Times New Roman"/>
+          <w:sz w:val="24"/>
+          <w:szCs w:val="24"/>
+          <w:lang w:eastAsia="en-IN"/>
+        </w:rPr>
+        <w:t>color</w:t>
+      </w:r>
+      <w:proofErr w:type="spellEnd"/>
+      <w:r>
+        <w:rPr>
+          <w:rFonts w:ascii="Times New Roman" w:eastAsia="Times New Roman" w:hAnsi="Times New Roman" w:cs="Times New Roman"/>
+          <w:sz w:val="24"/>
+          <w:szCs w:val="24"/>
+          <w:lang w:eastAsia="en-IN"/>
+        </w:rPr>
+        <w:t xml:space="preserve"> variations. The augmentation intensity is kept moderate to preserve important plant </w:t>
+      </w:r>
+      <w:proofErr w:type="spellStart"/>
+      <w:r>
+        <w:rPr>
+          <w:rFonts w:ascii="Times New Roman" w:eastAsia="Times New Roman" w:hAnsi="Times New Roman" w:cs="Times New Roman"/>
+          <w:sz w:val="24"/>
+          <w:szCs w:val="24"/>
+          <w:lang w:eastAsia="en-IN"/>
+        </w:rPr>
+        <w:t>color</w:t>
+      </w:r>
+      <w:proofErr w:type="spellEnd"/>
+      <w:r>
+        <w:rPr>
+          <w:rFonts w:ascii="Times New Roman" w:eastAsia="Times New Roman" w:hAnsi="Times New Roman" w:cs="Times New Roman"/>
+          <w:sz w:val="24"/>
+          <w:szCs w:val="24"/>
+          <w:lang w:eastAsia="en-IN"/>
+        </w:rPr>
+        <w:t xml:space="preserve"> and structural features that are essential for distinguishing different tomato growth stages.</w:t>
       </w:r>
     </w:p>
     <w:p>
@@ -13542,7 +14811,27 @@
           <w:szCs w:val="24"/>
           <w:lang w:eastAsia="en-IN"/>
         </w:rPr>
-        <w:t xml:space="preserve"> illustrates the training log of the Phase-1 warm-up stage for the tomato growth stage classification model, where the EfficientNet backbone layers remain frozen and only the newly added classification layers are trained. The figure shows the initial improvement in training and validation accuracy as the model begins learning visual patterns corresponding to different tomato growth stages.</w:t>
+        <w:t xml:space="preserve"> illustrates the training log of the Phase-1 warm-up stage for the tomato growth stage classification model, where the </w:t>
+      </w:r>
+      <w:proofErr w:type="spellStart"/>
+      <w:r>
+        <w:rPr>
+          <w:rFonts w:ascii="Times New Roman" w:eastAsia="Times New Roman" w:hAnsi="Times New Roman" w:cs="Times New Roman"/>
+          <w:sz w:val="24"/>
+          <w:szCs w:val="24"/>
+          <w:lang w:eastAsia="en-IN"/>
+        </w:rPr>
+        <w:t>EfficientNet</w:t>
+      </w:r>
+      <w:proofErr w:type="spellEnd"/>
+      <w:r>
+        <w:rPr>
+          <w:rFonts w:ascii="Times New Roman" w:eastAsia="Times New Roman" w:hAnsi="Times New Roman" w:cs="Times New Roman"/>
+          <w:sz w:val="24"/>
+          <w:szCs w:val="24"/>
+          <w:lang w:eastAsia="en-IN"/>
+        </w:rPr>
+        <w:t xml:space="preserve"> backbone layers remain frozen and only the newly added classification layers are trained. The figure shows the initial improvement in training and validation accuracy as the model begins learning visual patterns corresponding to different tomato growth stages.</w:t>
       </w:r>
     </w:p>
     <w:p>
@@ -13942,7 +15231,27 @@
           <w:szCs w:val="24"/>
           <w:lang w:eastAsia="en-IN"/>
         </w:rPr>
-        <w:t xml:space="preserve"> illustrates the first few records of the processed greenhouse environmental dataset after data cleaning, temporal synchronization, and feature engineering applied in the AgriTwin-GH data processing pipeline.</w:t>
+        <w:t xml:space="preserve"> illustrates the first few records of the processed greenhouse environmental dataset after data cleaning, temporal synchronization, and feature engineering applied in the </w:t>
+      </w:r>
+      <w:proofErr w:type="spellStart"/>
+      <w:r>
+        <w:rPr>
+          <w:rFonts w:ascii="Times New Roman" w:eastAsia="Times New Roman" w:hAnsi="Times New Roman" w:cs="Times New Roman"/>
+          <w:sz w:val="24"/>
+          <w:szCs w:val="24"/>
+          <w:lang w:eastAsia="en-IN"/>
+        </w:rPr>
+        <w:t>AgriTwin</w:t>
+      </w:r>
+      <w:proofErr w:type="spellEnd"/>
+      <w:r>
+        <w:rPr>
+          <w:rFonts w:ascii="Times New Roman" w:eastAsia="Times New Roman" w:hAnsi="Times New Roman" w:cs="Times New Roman"/>
+          <w:sz w:val="24"/>
+          <w:szCs w:val="24"/>
+          <w:lang w:eastAsia="en-IN"/>
+        </w:rPr>
+        <w:t>-GH data processing pipeline.</w:t>
       </w:r>
     </w:p>
     <w:p>
@@ -14431,7 +15740,27 @@
           <w:szCs w:val="24"/>
           <w:lang w:eastAsia="en-IN"/>
         </w:rPr>
-        <w:t xml:space="preserve"> illustrates the change in training and validation loss values during model training, indicating the convergence behavior of the tomato disease detection model.</w:t>
+        <w:t xml:space="preserve"> illustrates the change in training and validation loss values during model training, indicating the convergence </w:t>
+      </w:r>
+      <w:proofErr w:type="spellStart"/>
+      <w:r>
+        <w:rPr>
+          <w:rFonts w:ascii="Times New Roman" w:eastAsia="Times New Roman" w:hAnsi="Times New Roman" w:cs="Times New Roman"/>
+          <w:sz w:val="24"/>
+          <w:szCs w:val="24"/>
+          <w:lang w:eastAsia="en-IN"/>
+        </w:rPr>
+        <w:t>behavior</w:t>
+      </w:r>
+      <w:proofErr w:type="spellEnd"/>
+      <w:r>
+        <w:rPr>
+          <w:rFonts w:ascii="Times New Roman" w:eastAsia="Times New Roman" w:hAnsi="Times New Roman" w:cs="Times New Roman"/>
+          <w:sz w:val="24"/>
+          <w:szCs w:val="24"/>
+          <w:lang w:eastAsia="en-IN"/>
+        </w:rPr>
+        <w:t xml:space="preserve"> of the tomato disease detection model.</w:t>
       </w:r>
     </w:p>
     <w:p>
@@ -15107,7 +16436,25 @@
           <w:sz w:val="24"/>
           <w:szCs w:val="24"/>
         </w:rPr>
-        <w:t>This report presented the development of the proposed AgriTwin-GH system, focusing on the design of an intelligent framework for greenhouse monitoring and crop analysis. The system architecture was structured through modular decomposition, enabling a clear separation of data processing, predictive analysis, and digital twin–based greenhouse control functionalities.</w:t>
+        <w:t xml:space="preserve">This report presented the development of the proposed </w:t>
+      </w:r>
+      <w:proofErr w:type="spellStart"/>
+      <w:r>
+        <w:rPr>
+          <w:rFonts w:ascii="Times New Roman" w:eastAsia="Times New Roman" w:hAnsi="Times New Roman" w:cs="Times New Roman"/>
+          <w:sz w:val="24"/>
+          <w:szCs w:val="24"/>
+        </w:rPr>
+        <w:t>AgriTwin</w:t>
+      </w:r>
+      <w:proofErr w:type="spellEnd"/>
+      <w:r>
+        <w:rPr>
+          <w:rFonts w:ascii="Times New Roman" w:eastAsia="Times New Roman" w:hAnsi="Times New Roman" w:cs="Times New Roman"/>
+          <w:sz w:val="24"/>
+          <w:szCs w:val="24"/>
+        </w:rPr>
+        <w:t>-GH system, focusing on the design of an intelligent framework for greenhouse monitoring and crop analysis. The system architecture was structured through modular decomposition, enabling a clear separation of data processing, predictive analysis, and digital twin–based greenhouse control functionalities.</w:t>
       </w:r>
     </w:p>
     <w:p>
@@ -15422,6 +16769,7 @@
                 <w:szCs w:val="24"/>
               </w:rPr>
             </w:pPr>
+            <w:proofErr w:type="spellStart"/>
             <w:r>
               <w:rPr>
                 <w:rFonts w:ascii="Times New Roman" w:hAnsi="Times New Roman" w:cs="Times New Roman"/>
@@ -15430,6 +16778,7 @@
               </w:rPr>
               <w:t>PlantVillage</w:t>
             </w:r>
+            <w:proofErr w:type="spellEnd"/>
           </w:p>
         </w:tc>
         <w:tc>
@@ -15963,6 +17312,7 @@
                 <w:szCs w:val="24"/>
               </w:rPr>
             </w:pPr>
+            <w:proofErr w:type="spellStart"/>
             <w:r>
               <w:rPr>
                 <w:rFonts w:ascii="Times New Roman" w:hAnsi="Times New Roman" w:cs="Times New Roman"/>
@@ -15971,6 +17321,7 @@
               </w:rPr>
               <w:t>TomatoPlantfactoryDataset</w:t>
             </w:r>
+            <w:proofErr w:type="spellEnd"/>
           </w:p>
         </w:tc>
         <w:tc>
@@ -16248,7 +17599,61 @@
           <w:sz w:val="24"/>
           <w:szCs w:val="24"/>
         </w:rPr>
-        <w:t xml:space="preserve">[1] E. Elbasi, N. Mostafa, C. Zaki, Z. AlArnaout, A. E. Topcu, and L. Saker, “Optimizing agricultural data analysis techniques through AI-powered decision-making processes,” </w:t>
+        <w:t xml:space="preserve">[1] E. </w:t>
+      </w:r>
+      <w:proofErr w:type="spellStart"/>
+      <w:r>
+        <w:rPr>
+          <w:rFonts w:ascii="Times New Roman" w:eastAsia="Times New Roman" w:hAnsi="Times New Roman" w:cs="Times New Roman"/>
+          <w:sz w:val="24"/>
+          <w:szCs w:val="24"/>
+        </w:rPr>
+        <w:t>Elbasi</w:t>
+      </w:r>
+      <w:proofErr w:type="spellEnd"/>
+      <w:r>
+        <w:rPr>
+          <w:rFonts w:ascii="Times New Roman" w:eastAsia="Times New Roman" w:hAnsi="Times New Roman" w:cs="Times New Roman"/>
+          <w:sz w:val="24"/>
+          <w:szCs w:val="24"/>
+        </w:rPr>
+        <w:t xml:space="preserve">, N. Mostafa, C. Zaki, Z. </w:t>
+      </w:r>
+      <w:proofErr w:type="spellStart"/>
+      <w:r>
+        <w:rPr>
+          <w:rFonts w:ascii="Times New Roman" w:eastAsia="Times New Roman" w:hAnsi="Times New Roman" w:cs="Times New Roman"/>
+          <w:sz w:val="24"/>
+          <w:szCs w:val="24"/>
+        </w:rPr>
+        <w:t>AlArnaout</w:t>
+      </w:r>
+      <w:proofErr w:type="spellEnd"/>
+      <w:r>
+        <w:rPr>
+          <w:rFonts w:ascii="Times New Roman" w:eastAsia="Times New Roman" w:hAnsi="Times New Roman" w:cs="Times New Roman"/>
+          <w:sz w:val="24"/>
+          <w:szCs w:val="24"/>
+        </w:rPr>
+        <w:t xml:space="preserve">, A. E. </w:t>
+      </w:r>
+      <w:proofErr w:type="spellStart"/>
+      <w:r>
+        <w:rPr>
+          <w:rFonts w:ascii="Times New Roman" w:eastAsia="Times New Roman" w:hAnsi="Times New Roman" w:cs="Times New Roman"/>
+          <w:sz w:val="24"/>
+          <w:szCs w:val="24"/>
+        </w:rPr>
+        <w:t>Topcu</w:t>
+      </w:r>
+      <w:proofErr w:type="spellEnd"/>
+      <w:r>
+        <w:rPr>
+          <w:rFonts w:ascii="Times New Roman" w:eastAsia="Times New Roman" w:hAnsi="Times New Roman" w:cs="Times New Roman"/>
+          <w:sz w:val="24"/>
+          <w:szCs w:val="24"/>
+        </w:rPr>
+        <w:t xml:space="preserve">, and L. Saker, “Optimizing agricultural data analysis techniques through AI-powered decision-making processes,” </w:t>
       </w:r>
       <w:r>
         <w:rPr>
@@ -16283,7 +17688,43 @@
           <w:sz w:val="24"/>
           <w:szCs w:val="24"/>
         </w:rPr>
-        <w:t xml:space="preserve">[2] M. Ghiasi, Z. Wang, M. Mehrandezh, and A. Mohammadi, “Optimal strategy for energy-efficient management of greenhouse climate control,” </w:t>
+        <w:t xml:space="preserve">[2] M. </w:t>
+      </w:r>
+      <w:proofErr w:type="spellStart"/>
+      <w:r>
+        <w:rPr>
+          <w:rFonts w:ascii="Times New Roman" w:eastAsia="Times New Roman" w:hAnsi="Times New Roman" w:cs="Times New Roman"/>
+          <w:sz w:val="24"/>
+          <w:szCs w:val="24"/>
+        </w:rPr>
+        <w:t>Ghiasi</w:t>
+      </w:r>
+      <w:proofErr w:type="spellEnd"/>
+      <w:r>
+        <w:rPr>
+          <w:rFonts w:ascii="Times New Roman" w:eastAsia="Times New Roman" w:hAnsi="Times New Roman" w:cs="Times New Roman"/>
+          <w:sz w:val="24"/>
+          <w:szCs w:val="24"/>
+        </w:rPr>
+        <w:t xml:space="preserve">, Z. Wang, M. </w:t>
+      </w:r>
+      <w:proofErr w:type="spellStart"/>
+      <w:r>
+        <w:rPr>
+          <w:rFonts w:ascii="Times New Roman" w:eastAsia="Times New Roman" w:hAnsi="Times New Roman" w:cs="Times New Roman"/>
+          <w:sz w:val="24"/>
+          <w:szCs w:val="24"/>
+        </w:rPr>
+        <w:t>Mehrandezh</w:t>
+      </w:r>
+      <w:proofErr w:type="spellEnd"/>
+      <w:r>
+        <w:rPr>
+          <w:rFonts w:ascii="Times New Roman" w:eastAsia="Times New Roman" w:hAnsi="Times New Roman" w:cs="Times New Roman"/>
+          <w:sz w:val="24"/>
+          <w:szCs w:val="24"/>
+        </w:rPr>
+        <w:t xml:space="preserve">, and A. Mohammadi, “Optimal strategy for energy-efficient management of greenhouse climate control,” </w:t>
       </w:r>
       <w:r>
         <w:rPr>
@@ -16318,7 +17759,61 @@
           <w:sz w:val="24"/>
           <w:szCs w:val="24"/>
         </w:rPr>
-        <w:t xml:space="preserve">[3] D. A. Howard, Z. Ma, C. Veje, A. Clausen, J. M. Aaslyng, and B. N. Jørgensen, “Greenhouse industry 4.0 – digital twin technology for commercial greenhouses,” </w:t>
+        <w:t xml:space="preserve">[3] D. A. Howard, Z. Ma, C. </w:t>
+      </w:r>
+      <w:proofErr w:type="spellStart"/>
+      <w:r>
+        <w:rPr>
+          <w:rFonts w:ascii="Times New Roman" w:eastAsia="Times New Roman" w:hAnsi="Times New Roman" w:cs="Times New Roman"/>
+          <w:sz w:val="24"/>
+          <w:szCs w:val="24"/>
+        </w:rPr>
+        <w:t>Veje</w:t>
+      </w:r>
+      <w:proofErr w:type="spellEnd"/>
+      <w:r>
+        <w:rPr>
+          <w:rFonts w:ascii="Times New Roman" w:eastAsia="Times New Roman" w:hAnsi="Times New Roman" w:cs="Times New Roman"/>
+          <w:sz w:val="24"/>
+          <w:szCs w:val="24"/>
+        </w:rPr>
+        <w:t xml:space="preserve">, A. Clausen, J. M. </w:t>
+      </w:r>
+      <w:proofErr w:type="spellStart"/>
+      <w:r>
+        <w:rPr>
+          <w:rFonts w:ascii="Times New Roman" w:eastAsia="Times New Roman" w:hAnsi="Times New Roman" w:cs="Times New Roman"/>
+          <w:sz w:val="24"/>
+          <w:szCs w:val="24"/>
+        </w:rPr>
+        <w:t>Aaslyng</w:t>
+      </w:r>
+      <w:proofErr w:type="spellEnd"/>
+      <w:r>
+        <w:rPr>
+          <w:rFonts w:ascii="Times New Roman" w:eastAsia="Times New Roman" w:hAnsi="Times New Roman" w:cs="Times New Roman"/>
+          <w:sz w:val="24"/>
+          <w:szCs w:val="24"/>
+        </w:rPr>
+        <w:t xml:space="preserve">, and B. N. </w:t>
+      </w:r>
+      <w:proofErr w:type="spellStart"/>
+      <w:r>
+        <w:rPr>
+          <w:rFonts w:ascii="Times New Roman" w:eastAsia="Times New Roman" w:hAnsi="Times New Roman" w:cs="Times New Roman"/>
+          <w:sz w:val="24"/>
+          <w:szCs w:val="24"/>
+        </w:rPr>
+        <w:t>Jørgensen</w:t>
+      </w:r>
+      <w:proofErr w:type="spellEnd"/>
+      <w:r>
+        <w:rPr>
+          <w:rFonts w:ascii="Times New Roman" w:eastAsia="Times New Roman" w:hAnsi="Times New Roman" w:cs="Times New Roman"/>
+          <w:sz w:val="24"/>
+          <w:szCs w:val="24"/>
+        </w:rPr>
+        <w:t xml:space="preserve">, “Greenhouse industry 4.0 – digital twin technology for commercial greenhouses,” </w:t>
       </w:r>
       <w:r>
         <w:rPr>
@@ -16388,7 +17883,25 @@
           <w:sz w:val="24"/>
           <w:szCs w:val="24"/>
         </w:rPr>
-        <w:t xml:space="preserve">[5] D. S. Joseph, P. M. Pawar, and K. Chakradeo, “Real-time plant disease dataset development and detection of plant disease using deep learning,” </w:t>
+        <w:t xml:space="preserve">[5] D. S. Joseph, P. M. Pawar, and K. </w:t>
+      </w:r>
+      <w:proofErr w:type="spellStart"/>
+      <w:r>
+        <w:rPr>
+          <w:rFonts w:ascii="Times New Roman" w:eastAsia="Times New Roman" w:hAnsi="Times New Roman" w:cs="Times New Roman"/>
+          <w:sz w:val="24"/>
+          <w:szCs w:val="24"/>
+        </w:rPr>
+        <w:t>Chakradeo</w:t>
+      </w:r>
+      <w:proofErr w:type="spellEnd"/>
+      <w:r>
+        <w:rPr>
+          <w:rFonts w:ascii="Times New Roman" w:eastAsia="Times New Roman" w:hAnsi="Times New Roman" w:cs="Times New Roman"/>
+          <w:sz w:val="24"/>
+          <w:szCs w:val="24"/>
+        </w:rPr>
+        <w:t xml:space="preserve">, “Real-time plant disease dataset development and detection of plant disease using deep learning,” </w:t>
       </w:r>
       <w:r>
         <w:rPr>
@@ -16458,7 +17971,25 @@
           <w:sz w:val="24"/>
           <w:szCs w:val="24"/>
         </w:rPr>
-        <w:t xml:space="preserve">[7] D. K. Lee, B. K. Kang, Y. J. Kim, T. G. An, and Y. T. Chae, “A digital twin-based framework for precision tomato cultivation: Integrating XGBoost-based prediction with model predictive control,” </w:t>
+        <w:t xml:space="preserve">[7] D. K. Lee, B. K. Kang, Y. J. Kim, T. G. An, and Y. T. Chae, “A digital twin-based framework for precision tomato cultivation: Integrating </w:t>
+      </w:r>
+      <w:proofErr w:type="spellStart"/>
+      <w:r>
+        <w:rPr>
+          <w:rFonts w:ascii="Times New Roman" w:eastAsia="Times New Roman" w:hAnsi="Times New Roman" w:cs="Times New Roman"/>
+          <w:sz w:val="24"/>
+          <w:szCs w:val="24"/>
+        </w:rPr>
+        <w:t>XGBoost</w:t>
+      </w:r>
+      <w:proofErr w:type="spellEnd"/>
+      <w:r>
+        <w:rPr>
+          <w:rFonts w:ascii="Times New Roman" w:eastAsia="Times New Roman" w:hAnsi="Times New Roman" w:cs="Times New Roman"/>
+          <w:sz w:val="24"/>
+          <w:szCs w:val="24"/>
+        </w:rPr>
+        <w:t xml:space="preserve">-based prediction with model predictive control,” </w:t>
       </w:r>
       <w:r>
         <w:rPr>
@@ -16529,7 +18060,61 @@
           <w:sz w:val="24"/>
           <w:szCs w:val="24"/>
         </w:rPr>
-        <w:t xml:space="preserve">[9] B. V. Nikitha, N. K. S. Keerthan, P. Praneeth, and T. Amrita, “Leaf disease detection and classification,” </w:t>
+        <w:t xml:space="preserve">[9] B. V. </w:t>
+      </w:r>
+      <w:proofErr w:type="spellStart"/>
+      <w:r>
+        <w:rPr>
+          <w:rFonts w:ascii="Times New Roman" w:eastAsia="Times New Roman" w:hAnsi="Times New Roman" w:cs="Times New Roman"/>
+          <w:sz w:val="24"/>
+          <w:szCs w:val="24"/>
+        </w:rPr>
+        <w:t>Nikitha</w:t>
+      </w:r>
+      <w:proofErr w:type="spellEnd"/>
+      <w:r>
+        <w:rPr>
+          <w:rFonts w:ascii="Times New Roman" w:eastAsia="Times New Roman" w:hAnsi="Times New Roman" w:cs="Times New Roman"/>
+          <w:sz w:val="24"/>
+          <w:szCs w:val="24"/>
+        </w:rPr>
+        <w:t xml:space="preserve">, N. K. S. </w:t>
+      </w:r>
+      <w:proofErr w:type="spellStart"/>
+      <w:r>
+        <w:rPr>
+          <w:rFonts w:ascii="Times New Roman" w:eastAsia="Times New Roman" w:hAnsi="Times New Roman" w:cs="Times New Roman"/>
+          <w:sz w:val="24"/>
+          <w:szCs w:val="24"/>
+        </w:rPr>
+        <w:t>Keerthan</w:t>
+      </w:r>
+      <w:proofErr w:type="spellEnd"/>
+      <w:r>
+        <w:rPr>
+          <w:rFonts w:ascii="Times New Roman" w:eastAsia="Times New Roman" w:hAnsi="Times New Roman" w:cs="Times New Roman"/>
+          <w:sz w:val="24"/>
+          <w:szCs w:val="24"/>
+        </w:rPr>
+        <w:t xml:space="preserve">, P. </w:t>
+      </w:r>
+      <w:proofErr w:type="spellStart"/>
+      <w:r>
+        <w:rPr>
+          <w:rFonts w:ascii="Times New Roman" w:eastAsia="Times New Roman" w:hAnsi="Times New Roman" w:cs="Times New Roman"/>
+          <w:sz w:val="24"/>
+          <w:szCs w:val="24"/>
+        </w:rPr>
+        <w:t>Praneeth</w:t>
+      </w:r>
+      <w:proofErr w:type="spellEnd"/>
+      <w:r>
+        <w:rPr>
+          <w:rFonts w:ascii="Times New Roman" w:eastAsia="Times New Roman" w:hAnsi="Times New Roman" w:cs="Times New Roman"/>
+          <w:sz w:val="24"/>
+          <w:szCs w:val="24"/>
+        </w:rPr>
+        <w:t xml:space="preserve">, and T. Amrita, “Leaf disease detection and classification,” </w:t>
       </w:r>
       <w:r>
         <w:rPr>
@@ -16599,7 +18184,25 @@
           <w:sz w:val="24"/>
           <w:szCs w:val="24"/>
         </w:rPr>
-        <w:t xml:space="preserve">[11] A. Soussi, E. Zero, C. D. C. Herrera, et al., “Integrating digital twins and model predictive control for sustainable greenhouse management in smart agriculture,” </w:t>
+        <w:t xml:space="preserve">[11] A. </w:t>
+      </w:r>
+      <w:proofErr w:type="spellStart"/>
+      <w:r>
+        <w:rPr>
+          <w:rFonts w:ascii="Times New Roman" w:eastAsia="Times New Roman" w:hAnsi="Times New Roman" w:cs="Times New Roman"/>
+          <w:sz w:val="24"/>
+          <w:szCs w:val="24"/>
+        </w:rPr>
+        <w:t>Soussi</w:t>
+      </w:r>
+      <w:proofErr w:type="spellEnd"/>
+      <w:r>
+        <w:rPr>
+          <w:rFonts w:ascii="Times New Roman" w:eastAsia="Times New Roman" w:hAnsi="Times New Roman" w:cs="Times New Roman"/>
+          <w:sz w:val="24"/>
+          <w:szCs w:val="24"/>
+        </w:rPr>
+        <w:t xml:space="preserve">, E. Zero, C. D. C. Herrera, et al., “Integrating digital twins and model predictive control for sustainable greenhouse management in smart agriculture,” </w:t>
       </w:r>
       <w:r>
         <w:rPr>
@@ -16609,7 +18212,29 @@
           <w:sz w:val="24"/>
           <w:szCs w:val="24"/>
         </w:rPr>
-        <w:t>IEEE Transactions on AgriFood Electronics</w:t>
+        <w:t xml:space="preserve">IEEE Transactions on </w:t>
+      </w:r>
+      <w:proofErr w:type="spellStart"/>
+      <w:r>
+        <w:rPr>
+          <w:rFonts w:ascii="Times New Roman" w:eastAsia="Times New Roman" w:hAnsi="Times New Roman" w:cs="Times New Roman"/>
+          <w:i/>
+          <w:iCs/>
+          <w:sz w:val="24"/>
+          <w:szCs w:val="24"/>
+        </w:rPr>
+        <w:t>AgriFood</w:t>
+      </w:r>
+      <w:proofErr w:type="spellEnd"/>
+      <w:r>
+        <w:rPr>
+          <w:rFonts w:ascii="Times New Roman" w:eastAsia="Times New Roman" w:hAnsi="Times New Roman" w:cs="Times New Roman"/>
+          <w:i/>
+          <w:iCs/>
+          <w:sz w:val="24"/>
+          <w:szCs w:val="24"/>
+        </w:rPr>
+        <w:t xml:space="preserve"> Electronics</w:t>
       </w:r>
       <w:r>
         <w:rPr>
@@ -16634,7 +18259,25 @@
           <w:sz w:val="24"/>
           <w:szCs w:val="24"/>
         </w:rPr>
-        <w:t xml:space="preserve">[12] A. F. Subahi and K. E. Bouazza, “An intelligent IoT-based system design for controlling and monitoring greenhouse temperature,” </w:t>
+        <w:t xml:space="preserve">[12] A. F. Subahi and K. E. </w:t>
+      </w:r>
+      <w:proofErr w:type="spellStart"/>
+      <w:r>
+        <w:rPr>
+          <w:rFonts w:ascii="Times New Roman" w:eastAsia="Times New Roman" w:hAnsi="Times New Roman" w:cs="Times New Roman"/>
+          <w:sz w:val="24"/>
+          <w:szCs w:val="24"/>
+        </w:rPr>
+        <w:t>Bouazza</w:t>
+      </w:r>
+      <w:proofErr w:type="spellEnd"/>
+      <w:r>
+        <w:rPr>
+          <w:rFonts w:ascii="Times New Roman" w:eastAsia="Times New Roman" w:hAnsi="Times New Roman" w:cs="Times New Roman"/>
+          <w:sz w:val="24"/>
+          <w:szCs w:val="24"/>
+        </w:rPr>
+        <w:t xml:space="preserve">, “An intelligent IoT-based system design for controlling and monitoring greenhouse temperature,” </w:t>
       </w:r>
       <w:r>
         <w:rPr>

</xml_diff>